<commit_message>
Redesign passport: bigger photo box, clean achievements page
Left page: prominent photo square (~44mm), FIO fields, address, squad,
two signature lines. Right page: ДОСТИЖЕНИЯ title + blank area for stickers.

Co-Authored-By: Claude Sonnet 4.6 <noreply@anthropic.com>
Claude-Session: https://claude.ai/code/session_01HknypMbf5KxHqKosFxp9qv
</commit_message>
<xml_diff>
--- a/passport-chaikagrad.docx
+++ b/passport-chaikagrad.docx
@@ -49,7 +49,7 @@
                 <w:p/>
                 <w:p>
                   <w:pPr>
-                    <w:spacing w:before="60" w:after="40"/>
+                    <w:spacing w:before="60" w:after="60"/>
                     <w:jc w:val="center"/>
                     <w:pBdr>
                       <w:bottom w:val="single" w:sz="4" w:space="1" w:color="0D2D5E"/>
@@ -59,7 +59,7 @@
                     <w:rPr>
                       <w:b/>
                       <w:color w:val="0D2D5E"/>
-                      <w:sz w:val="12"/>
+                      <w:sz w:val="13"/>
                     </w:rPr>
                     <w:t>ЧАЙКАГРАД  ·  ЛИЧНЫЕ СВЕДЕНИЯ</w:t>
                   </w:r>
@@ -77,13 +77,14 @@
                   <w:tr>
                     <w:tc>
                       <w:tcPr>
-                        <w:tcW w:type="dxa" w:w="1814"/>
+                        <w:tcW w:type="dxa" w:w="2154"/>
                         <w:tcBorders>
                           <w:top w:val="none" w:sz="4" w:space="0" w:color="000000"/>
                           <w:bottom w:val="none" w:sz="4" w:space="0" w:color="000000"/>
                           <w:left w:val="none" w:sz="4" w:space="0" w:color="000000"/>
                           <w:right w:val="none" w:sz="4" w:space="0" w:color="000000"/>
                         </w:tcBorders>
+                        <w:vAlign w:val="top"/>
                       </w:tcPr>
                       <w:p/>
                       <w:tbl>
@@ -92,32 +93,34 @@
                           <w:tblLook w:firstColumn="1" w:firstRow="1" w:lastColumn="0" w:lastRow="0" w:noHBand="0" w:noVBand="1" w:val="04A0"/>
                         </w:tblPr>
                         <w:tblGrid>
-                          <w:gridCol w:w="1814"/>
+                          <w:gridCol w:w="2154"/>
                         </w:tblGrid>
                         <w:tr>
                           <w:trPr>
-                            <w:trHeight w:val="1417" w:hRule="exact"/>
+                            <w:trHeight w:val="1733" w:hRule="exact"/>
                           </w:trPr>
                           <w:tc>
                             <w:tcPr>
-                              <w:tcW w:type="dxa" w:w="1587"/>
+                              <w:tcW w:type="dxa" w:w="2041"/>
                               <w:tcBorders>
-                                <w:top w:val="single" w:sz="6" w:space="0" w:color="0D2D5E"/>
-                                <w:bottom w:val="single" w:sz="6" w:space="0" w:color="0D2D5E"/>
-                                <w:left w:val="single" w:sz="6" w:space="0" w:color="0D2D5E"/>
-                                <w:right w:val="single" w:sz="6" w:space="0" w:color="0D2D5E"/>
+                                <w:top w:val="single" w:sz="12" w:space="0" w:color="0D2D5E"/>
+                                <w:bottom w:val="single" w:sz="12" w:space="0" w:color="0D2D5E"/>
+                                <w:left w:val="single" w:sz="12" w:space="0" w:color="0D2D5E"/>
+                                <w:right w:val="single" w:sz="12" w:space="0" w:color="0D2D5E"/>
                               </w:tcBorders>
+                              <w:vAlign w:val="center"/>
                             </w:tcPr>
                             <w:p/>
                             <w:p>
                               <w:pPr>
-                                <w:spacing w:before="440" w:after="0"/>
+                                <w:spacing w:before="0" w:after="0"/>
                                 <w:jc w:val="center"/>
                               </w:pPr>
                               <w:r>
                                 <w:rPr>
+                                  <w:b/>
                                   <w:color w:val="CCCCCC"/>
-                                  <w:sz w:val="13"/>
+                                  <w:sz w:val="16"/>
                                 </w:rPr>
                                 <w:t>ФОТО</w:t>
                               </w:r>
@@ -129,13 +132,14 @@
                     </w:tc>
                     <w:tc>
                       <w:tcPr>
-                        <w:tcW w:type="dxa" w:w="3572"/>
+                        <w:tcW w:type="dxa" w:w="3118"/>
                         <w:tcBorders>
                           <w:top w:val="none" w:sz="4" w:space="0" w:color="000000"/>
                           <w:bottom w:val="none" w:sz="4" w:space="0" w:color="000000"/>
                           <w:left w:val="none" w:sz="4" w:space="0" w:color="000000"/>
                           <w:right w:val="none" w:sz="4" w:space="0" w:color="000000"/>
                         </w:tcBorders>
+                        <w:vAlign w:val="top"/>
                       </w:tcPr>
                       <w:p/>
                       <w:tbl>
@@ -144,24 +148,25 @@
                           <w:tblLook w:firstColumn="1" w:firstRow="1" w:lastColumn="0" w:lastRow="0" w:noHBand="0" w:noVBand="1" w:val="04A0"/>
                         </w:tblPr>
                         <w:tblGrid>
-                          <w:gridCol w:w="1786"/>
-                          <w:gridCol w:w="1786"/>
+                          <w:gridCol w:w="1559"/>
+                          <w:gridCol w:w="1559"/>
                         </w:tblGrid>
                         <w:tr>
                           <w:tc>
                             <w:tcPr>
-                              <w:tcW w:type="dxa" w:w="1417"/>
+                              <w:tcW w:type="dxa" w:w="1587"/>
                               <w:tcBorders>
                                 <w:top w:val="none" w:sz="4" w:space="0" w:color="000000"/>
                                 <w:bottom w:val="none" w:sz="4" w:space="0" w:color="000000"/>
                                 <w:left w:val="none" w:sz="4" w:space="0" w:color="000000"/>
                                 <w:right w:val="none" w:sz="4" w:space="0" w:color="000000"/>
                               </w:tcBorders>
+                              <w:vAlign w:val="bottom"/>
                             </w:tcPr>
                             <w:p/>
                             <w:p>
                               <w:pPr>
-                                <w:spacing w:before="20" w:after="0"/>
+                                <w:spacing w:before="60" w:after="0"/>
                               </w:pPr>
                               <w:r>
                                 <w:rPr>
@@ -174,18 +179,19 @@
                           </w:tc>
                           <w:tc>
                             <w:tcPr>
-                              <w:tcW w:type="dxa" w:w="2098"/>
+                              <w:tcW w:type="dxa" w:w="1474"/>
                               <w:tcBorders>
                                 <w:top w:val="none" w:sz="4" w:space="0" w:color="000000"/>
-                                <w:bottom w:val="single" w:sz="4" w:space="0" w:color="555555"/>
+                                <w:bottom w:val="single" w:sz="6" w:space="0" w:color="444444"/>
                                 <w:left w:val="none" w:sz="4" w:space="0" w:color="000000"/>
                                 <w:right w:val="none" w:sz="4" w:space="0" w:color="000000"/>
                               </w:tcBorders>
+                              <w:vAlign w:val="bottom"/>
                             </w:tcPr>
                             <w:p/>
                             <w:p>
                               <w:pPr>
-                                <w:spacing w:before="20" w:after="40"/>
+                                <w:spacing w:before="60" w:after="20"/>
                               </w:pPr>
                             </w:p>
                           </w:tc>
@@ -198,24 +204,25 @@
                           <w:tblLook w:firstColumn="1" w:firstRow="1" w:lastColumn="0" w:lastRow="0" w:noHBand="0" w:noVBand="1" w:val="04A0"/>
                         </w:tblPr>
                         <w:tblGrid>
-                          <w:gridCol w:w="1786"/>
-                          <w:gridCol w:w="1786"/>
+                          <w:gridCol w:w="1559"/>
+                          <w:gridCol w:w="1559"/>
                         </w:tblGrid>
                         <w:tr>
                           <w:tc>
                             <w:tcPr>
-                              <w:tcW w:type="dxa" w:w="1417"/>
+                              <w:tcW w:type="dxa" w:w="1587"/>
                               <w:tcBorders>
                                 <w:top w:val="none" w:sz="4" w:space="0" w:color="000000"/>
                                 <w:bottom w:val="none" w:sz="4" w:space="0" w:color="000000"/>
                                 <w:left w:val="none" w:sz="4" w:space="0" w:color="000000"/>
                                 <w:right w:val="none" w:sz="4" w:space="0" w:color="000000"/>
                               </w:tcBorders>
+                              <w:vAlign w:val="bottom"/>
                             </w:tcPr>
                             <w:p/>
                             <w:p>
                               <w:pPr>
-                                <w:spacing w:before="20" w:after="0"/>
+                                <w:spacing w:before="60" w:after="0"/>
                               </w:pPr>
                               <w:r>
                                 <w:rPr>
@@ -228,18 +235,19 @@
                           </w:tc>
                           <w:tc>
                             <w:tcPr>
-                              <w:tcW w:type="dxa" w:w="2098"/>
+                              <w:tcW w:type="dxa" w:w="1474"/>
                               <w:tcBorders>
                                 <w:top w:val="none" w:sz="4" w:space="0" w:color="000000"/>
-                                <w:bottom w:val="single" w:sz="4" w:space="0" w:color="555555"/>
+                                <w:bottom w:val="single" w:sz="6" w:space="0" w:color="444444"/>
                                 <w:left w:val="none" w:sz="4" w:space="0" w:color="000000"/>
                                 <w:right w:val="none" w:sz="4" w:space="0" w:color="000000"/>
                               </w:tcBorders>
+                              <w:vAlign w:val="bottom"/>
                             </w:tcPr>
                             <w:p/>
                             <w:p>
                               <w:pPr>
-                                <w:spacing w:before="20" w:after="40"/>
+                                <w:spacing w:before="60" w:after="20"/>
                               </w:pPr>
                             </w:p>
                           </w:tc>
@@ -252,24 +260,25 @@
                           <w:tblLook w:firstColumn="1" w:firstRow="1" w:lastColumn="0" w:lastRow="0" w:noHBand="0" w:noVBand="1" w:val="04A0"/>
                         </w:tblPr>
                         <w:tblGrid>
-                          <w:gridCol w:w="1786"/>
-                          <w:gridCol w:w="1786"/>
+                          <w:gridCol w:w="1559"/>
+                          <w:gridCol w:w="1559"/>
                         </w:tblGrid>
                         <w:tr>
                           <w:tc>
                             <w:tcPr>
-                              <w:tcW w:type="dxa" w:w="1417"/>
+                              <w:tcW w:type="dxa" w:w="1587"/>
                               <w:tcBorders>
                                 <w:top w:val="none" w:sz="4" w:space="0" w:color="000000"/>
                                 <w:bottom w:val="none" w:sz="4" w:space="0" w:color="000000"/>
                                 <w:left w:val="none" w:sz="4" w:space="0" w:color="000000"/>
                                 <w:right w:val="none" w:sz="4" w:space="0" w:color="000000"/>
                               </w:tcBorders>
+                              <w:vAlign w:val="bottom"/>
                             </w:tcPr>
                             <w:p/>
                             <w:p>
                               <w:pPr>
-                                <w:spacing w:before="20" w:after="0"/>
+                                <w:spacing w:before="60" w:after="0"/>
                               </w:pPr>
                               <w:r>
                                 <w:rPr>
@@ -282,18 +291,19 @@
                           </w:tc>
                           <w:tc>
                             <w:tcPr>
-                              <w:tcW w:type="dxa" w:w="2098"/>
+                              <w:tcW w:type="dxa" w:w="1474"/>
                               <w:tcBorders>
                                 <w:top w:val="none" w:sz="4" w:space="0" w:color="000000"/>
-                                <w:bottom w:val="single" w:sz="4" w:space="0" w:color="555555"/>
+                                <w:bottom w:val="single" w:sz="6" w:space="0" w:color="444444"/>
                                 <w:left w:val="none" w:sz="4" w:space="0" w:color="000000"/>
                                 <w:right w:val="none" w:sz="4" w:space="0" w:color="000000"/>
                               </w:tcBorders>
+                              <w:vAlign w:val="bottom"/>
                             </w:tcPr>
                             <w:p/>
                             <w:p>
                               <w:pPr>
-                                <w:spacing w:before="20" w:after="40"/>
+                                <w:spacing w:before="60" w:after="20"/>
                               </w:pPr>
                             </w:p>
                           </w:tc>
@@ -306,24 +316,25 @@
                           <w:tblLook w:firstColumn="1" w:firstRow="1" w:lastColumn="0" w:lastRow="0" w:noHBand="0" w:noVBand="1" w:val="04A0"/>
                         </w:tblPr>
                         <w:tblGrid>
-                          <w:gridCol w:w="1786"/>
-                          <w:gridCol w:w="1786"/>
+                          <w:gridCol w:w="1559"/>
+                          <w:gridCol w:w="1559"/>
                         </w:tblGrid>
                         <w:tr>
                           <w:tc>
                             <w:tcPr>
-                              <w:tcW w:type="dxa" w:w="1417"/>
+                              <w:tcW w:type="dxa" w:w="1587"/>
                               <w:tcBorders>
                                 <w:top w:val="none" w:sz="4" w:space="0" w:color="000000"/>
                                 <w:bottom w:val="none" w:sz="4" w:space="0" w:color="000000"/>
                                 <w:left w:val="none" w:sz="4" w:space="0" w:color="000000"/>
                                 <w:right w:val="none" w:sz="4" w:space="0" w:color="000000"/>
                               </w:tcBorders>
+                              <w:vAlign w:val="bottom"/>
                             </w:tcPr>
                             <w:p/>
                             <w:p>
                               <w:pPr>
-                                <w:spacing w:before="20" w:after="0"/>
+                                <w:spacing w:before="60" w:after="0"/>
                               </w:pPr>
                               <w:r>
                                 <w:rPr>
@@ -336,18 +347,19 @@
                           </w:tc>
                           <w:tc>
                             <w:tcPr>
-                              <w:tcW w:type="dxa" w:w="2098"/>
+                              <w:tcW w:type="dxa" w:w="1474"/>
                               <w:tcBorders>
                                 <w:top w:val="none" w:sz="4" w:space="0" w:color="000000"/>
-                                <w:bottom w:val="single" w:sz="4" w:space="0" w:color="555555"/>
+                                <w:bottom w:val="single" w:sz="6" w:space="0" w:color="444444"/>
                                 <w:left w:val="none" w:sz="4" w:space="0" w:color="000000"/>
                                 <w:right w:val="none" w:sz="4" w:space="0" w:color="000000"/>
                               </w:tcBorders>
+                              <w:vAlign w:val="bottom"/>
                             </w:tcPr>
                             <w:p/>
                             <w:p>
                               <w:pPr>
-                                <w:spacing w:before="20" w:after="40"/>
+                                <w:spacing w:before="60" w:after="20"/>
                               </w:pPr>
                             </w:p>
                           </w:tc>
@@ -360,7 +372,7 @@
                 <w:p/>
                 <w:p>
                   <w:pPr>
-                    <w:spacing w:before="80" w:after="20"/>
+                    <w:spacing w:before="100" w:after="20"/>
                     <w:jc w:val="left"/>
                   </w:pPr>
                   <w:r>
@@ -386,7 +398,7 @@
                         <w:tcW w:type="dxa" w:w="5443"/>
                         <w:tcBorders>
                           <w:top w:val="none" w:sz="4" w:space="0" w:color="000000"/>
-                          <w:bottom w:val="single" w:sz="4" w:space="0" w:color="555555"/>
+                          <w:bottom w:val="single" w:sz="6" w:space="0" w:color="444444"/>
                           <w:left w:val="none" w:sz="4" w:space="0" w:color="000000"/>
                           <w:right w:val="none" w:sz="4" w:space="0" w:color="000000"/>
                         </w:tcBorders>
@@ -394,7 +406,7 @@
                       <w:p/>
                       <w:p>
                         <w:pPr>
-                          <w:spacing w:before="20" w:after="40"/>
+                          <w:spacing w:before="20" w:after="60"/>
                         </w:pPr>
                       </w:p>
                     </w:tc>
@@ -415,7 +427,7 @@
                         <w:tcW w:type="dxa" w:w="5443"/>
                         <w:tcBorders>
                           <w:top w:val="none" w:sz="4" w:space="0" w:color="000000"/>
-                          <w:bottom w:val="single" w:sz="4" w:space="0" w:color="555555"/>
+                          <w:bottom w:val="single" w:sz="6" w:space="0" w:color="444444"/>
                           <w:left w:val="none" w:sz="4" w:space="0" w:color="000000"/>
                           <w:right w:val="none" w:sz="4" w:space="0" w:color="000000"/>
                         </w:tcBorders>
@@ -423,7 +435,7 @@
                       <w:p/>
                       <w:p>
                         <w:pPr>
-                          <w:spacing w:before="20" w:after="40"/>
+                          <w:spacing w:before="20" w:after="60"/>
                         </w:pPr>
                       </w:p>
                     </w:tc>
@@ -442,23 +454,24 @@
                   <w:tr>
                     <w:tc>
                       <w:tcPr>
-                        <w:tcW w:type="dxa" w:w="1020"/>
+                        <w:tcW w:type="dxa" w:w="907"/>
                         <w:tcBorders>
                           <w:top w:val="none" w:sz="4" w:space="0" w:color="000000"/>
                           <w:bottom w:val="none" w:sz="4" w:space="0" w:color="000000"/>
                           <w:left w:val="none" w:sz="4" w:space="0" w:color="000000"/>
                           <w:right w:val="none" w:sz="4" w:space="0" w:color="000000"/>
                         </w:tcBorders>
+                        <w:vAlign w:val="bottom"/>
                       </w:tcPr>
                       <w:p/>
                       <w:p>
                         <w:pPr>
-                          <w:spacing w:before="80" w:after="0"/>
+                          <w:spacing w:before="80" w:after="20"/>
                         </w:pPr>
                         <w:r>
                           <w:rPr>
                             <w:color w:val="0D2D5E"/>
-                            <w:sz w:val="11"/>
+                            <w:sz w:val="12"/>
                           </w:rPr>
                           <w:t>Отряд</w:t>
                         </w:r>
@@ -466,13 +479,14 @@
                     </w:tc>
                     <w:tc>
                       <w:tcPr>
-                        <w:tcW w:type="dxa" w:w="4365"/>
+                        <w:tcW w:type="dxa" w:w="4479"/>
                         <w:tcBorders>
                           <w:top w:val="none" w:sz="4" w:space="0" w:color="000000"/>
-                          <w:bottom w:val="single" w:sz="4" w:space="0" w:color="555555"/>
+                          <w:bottom w:val="single" w:sz="6" w:space="0" w:color="444444"/>
                           <w:left w:val="none" w:sz="4" w:space="0" w:color="000000"/>
                           <w:right w:val="none" w:sz="4" w:space="0" w:color="000000"/>
                         </w:tcBorders>
+                        <w:vAlign w:val="bottom"/>
                       </w:tcPr>
                       <w:p/>
                       <w:p>
@@ -486,9 +500,9 @@
                 <w:p/>
                 <w:p>
                   <w:pPr>
-                    <w:spacing w:before="120" w:after="20"/>
+                    <w:spacing w:before="140" w:after="20"/>
                     <w:pBdr>
-                      <w:top w:val="single" w:sz="2" w:space="1" w:color="CCCCCC"/>
+                      <w:top w:val="single" w:sz="2" w:space="1" w:color="AAAAAA"/>
                     </w:pBdr>
                   </w:pPr>
                 </w:p>
@@ -553,14 +567,14 @@
                   </w:tr>
                   <w:tr>
                     <w:trPr>
-                      <w:trHeight w:val="393" w:hRule="exact"/>
+                      <w:trHeight w:val="433" w:hRule="exact"/>
                     </w:trPr>
                     <w:tc>
                       <w:tcPr>
                         <w:tcW w:type="dxa" w:w="2778"/>
                         <w:tcBorders>
                           <w:top w:val="none" w:sz="4" w:space="0" w:color="000000"/>
-                          <w:bottom w:val="single" w:sz="4" w:space="0" w:color="555555"/>
+                          <w:bottom w:val="single" w:sz="6" w:space="0" w:color="444444"/>
                           <w:left w:val="none" w:sz="4" w:space="0" w:color="000000"/>
                           <w:right w:val="none" w:sz="4" w:space="0" w:color="000000"/>
                         </w:tcBorders>
@@ -577,7 +591,7 @@
                         <w:tcW w:type="dxa" w:w="2778"/>
                         <w:tcBorders>
                           <w:top w:val="none" w:sz="4" w:space="0" w:color="000000"/>
-                          <w:bottom w:val="single" w:sz="4" w:space="0" w:color="555555"/>
+                          <w:bottom w:val="single" w:sz="6" w:space="0" w:color="444444"/>
                           <w:left w:val="none" w:sz="4" w:space="0" w:color="000000"/>
                           <w:right w:val="none" w:sz="4" w:space="0" w:color="000000"/>
                         </w:tcBorders>
@@ -604,7 +618,7 @@
                       <w:p/>
                       <w:p>
                         <w:pPr>
-                          <w:spacing w:before="0" w:after="0"/>
+                          <w:spacing w:before="0" w:after="40"/>
                           <w:jc w:val="center"/>
                         </w:pPr>
                         <w:r>
@@ -629,7 +643,7 @@
                       <w:p/>
                       <w:p>
                         <w:pPr>
-                          <w:spacing w:before="0" w:after="0"/>
+                          <w:spacing w:before="0" w:after="40"/>
                           <w:jc w:val="center"/>
                         </w:pPr>
                         <w:r>
@@ -659,7 +673,7 @@
                 <w:p/>
                 <w:p>
                   <w:pPr>
-                    <w:spacing w:before="60" w:after="40"/>
+                    <w:spacing w:before="60" w:after="60"/>
                     <w:jc w:val="center"/>
                     <w:pBdr>
                       <w:bottom w:val="single" w:sz="4" w:space="1" w:color="0D2D5E"/>
@@ -669,7 +683,7 @@
                     <w:rPr>
                       <w:b/>
                       <w:color w:val="0D2D5E"/>
-                      <w:sz w:val="12"/>
+                      <w:sz w:val="13"/>
                     </w:rPr>
                     <w:t>ЧАЙКАГРАД  ·  ДОСТИЖЕНИЯ</w:t>
                   </w:r>
@@ -680,774 +694,33 @@
                     <w:tblLook w:firstColumn="1" w:firstRow="1" w:lastColumn="0" w:lastRow="0" w:noHBand="0" w:noVBand="1" w:val="04A0"/>
                   </w:tblPr>
                   <w:tblGrid>
-                    <w:gridCol w:w="1852"/>
-                    <w:gridCol w:w="1852"/>
-                    <w:gridCol w:w="1852"/>
+                    <w:gridCol w:w="5556"/>
                   </w:tblGrid>
                   <w:tr>
+                    <w:trPr>
+                      <w:trHeight w:val="4253" w:hRule="atLeast"/>
+                    </w:trPr>
                     <w:tc>
                       <w:tcPr>
-                        <w:tcW w:type="dxa" w:w="312"/>
+                        <w:tcW w:type="dxa" w:w="5329"/>
                         <w:tcBorders>
-                          <w:top w:val="none" w:sz="4" w:space="0" w:color="000000"/>
-                          <w:bottom w:val="none" w:sz="4" w:space="0" w:color="000000"/>
-                          <w:left w:val="none" w:sz="4" w:space="0" w:color="000000"/>
-                          <w:right w:val="none" w:sz="4" w:space="0" w:color="000000"/>
+                          <w:top w:val="single" w:sz="4" w:space="0" w:color="CCCCCC"/>
+                          <w:bottom w:val="single" w:sz="4" w:space="0" w:color="CCCCCC"/>
+                          <w:left w:val="single" w:sz="4" w:space="0" w:color="CCCCCC"/>
+                          <w:right w:val="single" w:sz="4" w:space="0" w:color="CCCCCC"/>
                         </w:tcBorders>
+                        <w:vAlign w:val="top"/>
                       </w:tcPr>
                       <w:p/>
                       <w:p>
                         <w:pPr>
-                          <w:spacing w:before="60" w:after="0"/>
+                          <w:spacing w:before="0" w:after="0"/>
                         </w:pPr>
-                        <w:r>
-                          <w:rPr>
-                            <w:b/>
-                            <w:color w:val="0D2D5E"/>
-                            <w:sz w:val="14"/>
-                          </w:rPr>
-                          <w:t>1.</w:t>
-                        </w:r>
-                      </w:p>
-                    </w:tc>
-                    <w:tc>
-                      <w:tcPr>
-                        <w:tcW w:type="dxa" w:w="4535"/>
-                        <w:tcBorders>
-                          <w:top w:val="none" w:sz="4" w:space="0" w:color="000000"/>
-                          <w:bottom w:val="none" w:sz="4" w:space="0" w:color="000000"/>
-                          <w:left w:val="none" w:sz="4" w:space="0" w:color="000000"/>
-                          <w:right w:val="none" w:sz="4" w:space="0" w:color="000000"/>
-                        </w:tcBorders>
-                      </w:tcPr>
-                      <w:p/>
-                      <w:tbl>
-                        <w:tblPr>
-                          <w:tblW w:type="auto" w:w="0"/>
-                          <w:tblLook w:firstColumn="1" w:firstRow="1" w:lastColumn="0" w:lastRow="0" w:noHBand="0" w:noVBand="1" w:val="04A0"/>
-                        </w:tblPr>
-                        <w:tblGrid>
-                          <w:gridCol w:w="4535"/>
-                        </w:tblGrid>
-                        <w:tr>
-                          <w:tc>
-                            <w:tcPr>
-                              <w:tcW w:type="dxa" w:w="4535"/>
-                              <w:tcBorders>
-                                <w:top w:val="none" w:sz="4" w:space="0" w:color="000000"/>
-                                <w:bottom w:val="single" w:sz="2" w:space="0" w:color="BBBBBB"/>
-                                <w:left w:val="none" w:sz="4" w:space="0" w:color="000000"/>
-                                <w:right w:val="none" w:sz="4" w:space="0" w:color="000000"/>
-                              </w:tcBorders>
-                            </w:tcPr>
-                            <w:p/>
-                            <w:p>
-                              <w:pPr>
-                                <w:spacing w:before="20" w:after="40"/>
-                              </w:pPr>
-                            </w:p>
-                          </w:tc>
-                        </w:tr>
-                        <w:tr>
-                          <w:tc>
-                            <w:tcPr>
-                              <w:tcW w:type="dxa" w:w="4535"/>
-                              <w:tcBorders>
-                                <w:top w:val="none" w:sz="4" w:space="0" w:color="000000"/>
-                                <w:bottom w:val="single" w:sz="2" w:space="0" w:color="BBBBBB"/>
-                                <w:left w:val="none" w:sz="4" w:space="0" w:color="000000"/>
-                                <w:right w:val="none" w:sz="4" w:space="0" w:color="000000"/>
-                              </w:tcBorders>
-                            </w:tcPr>
-                            <w:p/>
-                            <w:p>
-                              <w:pPr>
-                                <w:spacing w:before="20" w:after="40"/>
-                              </w:pPr>
-                            </w:p>
-                          </w:tc>
-                        </w:tr>
-                      </w:tbl>
-                      <w:p/>
-                    </w:tc>
-                    <w:tc>
-                      <w:tcPr>
-                        <w:tcW w:type="dxa" w:w="680"/>
-                        <w:tcBorders>
-                          <w:top w:val="none" w:sz="4" w:space="0" w:color="000000"/>
-                          <w:bottom w:val="none" w:sz="4" w:space="0" w:color="000000"/>
-                          <w:left w:val="none" w:sz="4" w:space="0" w:color="000000"/>
-                          <w:right w:val="none" w:sz="4" w:space="0" w:color="000000"/>
-                        </w:tcBorders>
-                      </w:tcPr>
-                      <w:p/>
-                      <w:p>
-                        <w:pPr>
-                          <w:spacing w:before="40" w:after="0"/>
-                          <w:jc w:val="center"/>
-                        </w:pPr>
-                        <w:r>
-                          <w:rPr>
-                            <w:color w:val="CCCCCC"/>
-                            <w:sz w:val="36"/>
-                          </w:rPr>
-                          <w:t>◯</w:t>
-                        </w:r>
                       </w:p>
                     </w:tc>
                   </w:tr>
                 </w:tbl>
                 <w:p/>
-                <w:p>
-                  <w:pPr>
-                    <w:spacing w:before="0" w:after="20"/>
-                  </w:pPr>
-                </w:p>
-                <w:tbl>
-                  <w:tblPr>
-                    <w:tblW w:type="auto" w:w="0"/>
-                    <w:tblLook w:firstColumn="1" w:firstRow="1" w:lastColumn="0" w:lastRow="0" w:noHBand="0" w:noVBand="1" w:val="04A0"/>
-                  </w:tblPr>
-                  <w:tblGrid>
-                    <w:gridCol w:w="1852"/>
-                    <w:gridCol w:w="1852"/>
-                    <w:gridCol w:w="1852"/>
-                  </w:tblGrid>
-                  <w:tr>
-                    <w:tc>
-                      <w:tcPr>
-                        <w:tcW w:type="dxa" w:w="312"/>
-                        <w:tcBorders>
-                          <w:top w:val="none" w:sz="4" w:space="0" w:color="000000"/>
-                          <w:bottom w:val="none" w:sz="4" w:space="0" w:color="000000"/>
-                          <w:left w:val="none" w:sz="4" w:space="0" w:color="000000"/>
-                          <w:right w:val="none" w:sz="4" w:space="0" w:color="000000"/>
-                        </w:tcBorders>
-                      </w:tcPr>
-                      <w:p/>
-                      <w:p>
-                        <w:pPr>
-                          <w:spacing w:before="60" w:after="0"/>
-                        </w:pPr>
-                        <w:r>
-                          <w:rPr>
-                            <w:b/>
-                            <w:color w:val="0D2D5E"/>
-                            <w:sz w:val="14"/>
-                          </w:rPr>
-                          <w:t>2.</w:t>
-                        </w:r>
-                      </w:p>
-                    </w:tc>
-                    <w:tc>
-                      <w:tcPr>
-                        <w:tcW w:type="dxa" w:w="4535"/>
-                        <w:tcBorders>
-                          <w:top w:val="none" w:sz="4" w:space="0" w:color="000000"/>
-                          <w:bottom w:val="none" w:sz="4" w:space="0" w:color="000000"/>
-                          <w:left w:val="none" w:sz="4" w:space="0" w:color="000000"/>
-                          <w:right w:val="none" w:sz="4" w:space="0" w:color="000000"/>
-                        </w:tcBorders>
-                      </w:tcPr>
-                      <w:p/>
-                      <w:tbl>
-                        <w:tblPr>
-                          <w:tblW w:type="auto" w:w="0"/>
-                          <w:tblLook w:firstColumn="1" w:firstRow="1" w:lastColumn="0" w:lastRow="0" w:noHBand="0" w:noVBand="1" w:val="04A0"/>
-                        </w:tblPr>
-                        <w:tblGrid>
-                          <w:gridCol w:w="4535"/>
-                        </w:tblGrid>
-                        <w:tr>
-                          <w:tc>
-                            <w:tcPr>
-                              <w:tcW w:type="dxa" w:w="4535"/>
-                              <w:tcBorders>
-                                <w:top w:val="none" w:sz="4" w:space="0" w:color="000000"/>
-                                <w:bottom w:val="single" w:sz="2" w:space="0" w:color="BBBBBB"/>
-                                <w:left w:val="none" w:sz="4" w:space="0" w:color="000000"/>
-                                <w:right w:val="none" w:sz="4" w:space="0" w:color="000000"/>
-                              </w:tcBorders>
-                            </w:tcPr>
-                            <w:p/>
-                            <w:p>
-                              <w:pPr>
-                                <w:spacing w:before="20" w:after="40"/>
-                              </w:pPr>
-                            </w:p>
-                          </w:tc>
-                        </w:tr>
-                        <w:tr>
-                          <w:tc>
-                            <w:tcPr>
-                              <w:tcW w:type="dxa" w:w="4535"/>
-                              <w:tcBorders>
-                                <w:top w:val="none" w:sz="4" w:space="0" w:color="000000"/>
-                                <w:bottom w:val="single" w:sz="2" w:space="0" w:color="BBBBBB"/>
-                                <w:left w:val="none" w:sz="4" w:space="0" w:color="000000"/>
-                                <w:right w:val="none" w:sz="4" w:space="0" w:color="000000"/>
-                              </w:tcBorders>
-                            </w:tcPr>
-                            <w:p/>
-                            <w:p>
-                              <w:pPr>
-                                <w:spacing w:before="20" w:after="40"/>
-                              </w:pPr>
-                            </w:p>
-                          </w:tc>
-                        </w:tr>
-                      </w:tbl>
-                      <w:p/>
-                    </w:tc>
-                    <w:tc>
-                      <w:tcPr>
-                        <w:tcW w:type="dxa" w:w="680"/>
-                        <w:tcBorders>
-                          <w:top w:val="none" w:sz="4" w:space="0" w:color="000000"/>
-                          <w:bottom w:val="none" w:sz="4" w:space="0" w:color="000000"/>
-                          <w:left w:val="none" w:sz="4" w:space="0" w:color="000000"/>
-                          <w:right w:val="none" w:sz="4" w:space="0" w:color="000000"/>
-                        </w:tcBorders>
-                      </w:tcPr>
-                      <w:p/>
-                      <w:p>
-                        <w:pPr>
-                          <w:spacing w:before="40" w:after="0"/>
-                          <w:jc w:val="center"/>
-                        </w:pPr>
-                        <w:r>
-                          <w:rPr>
-                            <w:color w:val="CCCCCC"/>
-                            <w:sz w:val="36"/>
-                          </w:rPr>
-                          <w:t>◯</w:t>
-                        </w:r>
-                      </w:p>
-                    </w:tc>
-                  </w:tr>
-                </w:tbl>
-                <w:p/>
-                <w:p>
-                  <w:pPr>
-                    <w:spacing w:before="0" w:after="20"/>
-                  </w:pPr>
-                </w:p>
-                <w:tbl>
-                  <w:tblPr>
-                    <w:tblW w:type="auto" w:w="0"/>
-                    <w:tblLook w:firstColumn="1" w:firstRow="1" w:lastColumn="0" w:lastRow="0" w:noHBand="0" w:noVBand="1" w:val="04A0"/>
-                  </w:tblPr>
-                  <w:tblGrid>
-                    <w:gridCol w:w="1852"/>
-                    <w:gridCol w:w="1852"/>
-                    <w:gridCol w:w="1852"/>
-                  </w:tblGrid>
-                  <w:tr>
-                    <w:tc>
-                      <w:tcPr>
-                        <w:tcW w:type="dxa" w:w="312"/>
-                        <w:tcBorders>
-                          <w:top w:val="none" w:sz="4" w:space="0" w:color="000000"/>
-                          <w:bottom w:val="none" w:sz="4" w:space="0" w:color="000000"/>
-                          <w:left w:val="none" w:sz="4" w:space="0" w:color="000000"/>
-                          <w:right w:val="none" w:sz="4" w:space="0" w:color="000000"/>
-                        </w:tcBorders>
-                      </w:tcPr>
-                      <w:p/>
-                      <w:p>
-                        <w:pPr>
-                          <w:spacing w:before="60" w:after="0"/>
-                        </w:pPr>
-                        <w:r>
-                          <w:rPr>
-                            <w:b/>
-                            <w:color w:val="0D2D5E"/>
-                            <w:sz w:val="14"/>
-                          </w:rPr>
-                          <w:t>3.</w:t>
-                        </w:r>
-                      </w:p>
-                    </w:tc>
-                    <w:tc>
-                      <w:tcPr>
-                        <w:tcW w:type="dxa" w:w="4535"/>
-                        <w:tcBorders>
-                          <w:top w:val="none" w:sz="4" w:space="0" w:color="000000"/>
-                          <w:bottom w:val="none" w:sz="4" w:space="0" w:color="000000"/>
-                          <w:left w:val="none" w:sz="4" w:space="0" w:color="000000"/>
-                          <w:right w:val="none" w:sz="4" w:space="0" w:color="000000"/>
-                        </w:tcBorders>
-                      </w:tcPr>
-                      <w:p/>
-                      <w:tbl>
-                        <w:tblPr>
-                          <w:tblW w:type="auto" w:w="0"/>
-                          <w:tblLook w:firstColumn="1" w:firstRow="1" w:lastColumn="0" w:lastRow="0" w:noHBand="0" w:noVBand="1" w:val="04A0"/>
-                        </w:tblPr>
-                        <w:tblGrid>
-                          <w:gridCol w:w="4535"/>
-                        </w:tblGrid>
-                        <w:tr>
-                          <w:tc>
-                            <w:tcPr>
-                              <w:tcW w:type="dxa" w:w="4535"/>
-                              <w:tcBorders>
-                                <w:top w:val="none" w:sz="4" w:space="0" w:color="000000"/>
-                                <w:bottom w:val="single" w:sz="2" w:space="0" w:color="BBBBBB"/>
-                                <w:left w:val="none" w:sz="4" w:space="0" w:color="000000"/>
-                                <w:right w:val="none" w:sz="4" w:space="0" w:color="000000"/>
-                              </w:tcBorders>
-                            </w:tcPr>
-                            <w:p/>
-                            <w:p>
-                              <w:pPr>
-                                <w:spacing w:before="20" w:after="40"/>
-                              </w:pPr>
-                            </w:p>
-                          </w:tc>
-                        </w:tr>
-                        <w:tr>
-                          <w:tc>
-                            <w:tcPr>
-                              <w:tcW w:type="dxa" w:w="4535"/>
-                              <w:tcBorders>
-                                <w:top w:val="none" w:sz="4" w:space="0" w:color="000000"/>
-                                <w:bottom w:val="single" w:sz="2" w:space="0" w:color="BBBBBB"/>
-                                <w:left w:val="none" w:sz="4" w:space="0" w:color="000000"/>
-                                <w:right w:val="none" w:sz="4" w:space="0" w:color="000000"/>
-                              </w:tcBorders>
-                            </w:tcPr>
-                            <w:p/>
-                            <w:p>
-                              <w:pPr>
-                                <w:spacing w:before="20" w:after="40"/>
-                              </w:pPr>
-                            </w:p>
-                          </w:tc>
-                        </w:tr>
-                      </w:tbl>
-                      <w:p/>
-                    </w:tc>
-                    <w:tc>
-                      <w:tcPr>
-                        <w:tcW w:type="dxa" w:w="680"/>
-                        <w:tcBorders>
-                          <w:top w:val="none" w:sz="4" w:space="0" w:color="000000"/>
-                          <w:bottom w:val="none" w:sz="4" w:space="0" w:color="000000"/>
-                          <w:left w:val="none" w:sz="4" w:space="0" w:color="000000"/>
-                          <w:right w:val="none" w:sz="4" w:space="0" w:color="000000"/>
-                        </w:tcBorders>
-                      </w:tcPr>
-                      <w:p/>
-                      <w:p>
-                        <w:pPr>
-                          <w:spacing w:before="40" w:after="0"/>
-                          <w:jc w:val="center"/>
-                        </w:pPr>
-                        <w:r>
-                          <w:rPr>
-                            <w:color w:val="CCCCCC"/>
-                            <w:sz w:val="36"/>
-                          </w:rPr>
-                          <w:t>◯</w:t>
-                        </w:r>
-                      </w:p>
-                    </w:tc>
-                  </w:tr>
-                </w:tbl>
-                <w:p/>
-                <w:p>
-                  <w:pPr>
-                    <w:spacing w:before="0" w:after="20"/>
-                  </w:pPr>
-                </w:p>
-                <w:tbl>
-                  <w:tblPr>
-                    <w:tblW w:type="auto" w:w="0"/>
-                    <w:tblLook w:firstColumn="1" w:firstRow="1" w:lastColumn="0" w:lastRow="0" w:noHBand="0" w:noVBand="1" w:val="04A0"/>
-                  </w:tblPr>
-                  <w:tblGrid>
-                    <w:gridCol w:w="1852"/>
-                    <w:gridCol w:w="1852"/>
-                    <w:gridCol w:w="1852"/>
-                  </w:tblGrid>
-                  <w:tr>
-                    <w:tc>
-                      <w:tcPr>
-                        <w:tcW w:type="dxa" w:w="312"/>
-                        <w:tcBorders>
-                          <w:top w:val="none" w:sz="4" w:space="0" w:color="000000"/>
-                          <w:bottom w:val="none" w:sz="4" w:space="0" w:color="000000"/>
-                          <w:left w:val="none" w:sz="4" w:space="0" w:color="000000"/>
-                          <w:right w:val="none" w:sz="4" w:space="0" w:color="000000"/>
-                        </w:tcBorders>
-                      </w:tcPr>
-                      <w:p/>
-                      <w:p>
-                        <w:pPr>
-                          <w:spacing w:before="60" w:after="0"/>
-                        </w:pPr>
-                        <w:r>
-                          <w:rPr>
-                            <w:b/>
-                            <w:color w:val="0D2D5E"/>
-                            <w:sz w:val="14"/>
-                          </w:rPr>
-                          <w:t>4.</w:t>
-                        </w:r>
-                      </w:p>
-                    </w:tc>
-                    <w:tc>
-                      <w:tcPr>
-                        <w:tcW w:type="dxa" w:w="4535"/>
-                        <w:tcBorders>
-                          <w:top w:val="none" w:sz="4" w:space="0" w:color="000000"/>
-                          <w:bottom w:val="none" w:sz="4" w:space="0" w:color="000000"/>
-                          <w:left w:val="none" w:sz="4" w:space="0" w:color="000000"/>
-                          <w:right w:val="none" w:sz="4" w:space="0" w:color="000000"/>
-                        </w:tcBorders>
-                      </w:tcPr>
-                      <w:p/>
-                      <w:tbl>
-                        <w:tblPr>
-                          <w:tblW w:type="auto" w:w="0"/>
-                          <w:tblLook w:firstColumn="1" w:firstRow="1" w:lastColumn="0" w:lastRow="0" w:noHBand="0" w:noVBand="1" w:val="04A0"/>
-                        </w:tblPr>
-                        <w:tblGrid>
-                          <w:gridCol w:w="4535"/>
-                        </w:tblGrid>
-                        <w:tr>
-                          <w:tc>
-                            <w:tcPr>
-                              <w:tcW w:type="dxa" w:w="4535"/>
-                              <w:tcBorders>
-                                <w:top w:val="none" w:sz="4" w:space="0" w:color="000000"/>
-                                <w:bottom w:val="single" w:sz="2" w:space="0" w:color="BBBBBB"/>
-                                <w:left w:val="none" w:sz="4" w:space="0" w:color="000000"/>
-                                <w:right w:val="none" w:sz="4" w:space="0" w:color="000000"/>
-                              </w:tcBorders>
-                            </w:tcPr>
-                            <w:p/>
-                            <w:p>
-                              <w:pPr>
-                                <w:spacing w:before="20" w:after="40"/>
-                              </w:pPr>
-                            </w:p>
-                          </w:tc>
-                        </w:tr>
-                        <w:tr>
-                          <w:tc>
-                            <w:tcPr>
-                              <w:tcW w:type="dxa" w:w="4535"/>
-                              <w:tcBorders>
-                                <w:top w:val="none" w:sz="4" w:space="0" w:color="000000"/>
-                                <w:bottom w:val="single" w:sz="2" w:space="0" w:color="BBBBBB"/>
-                                <w:left w:val="none" w:sz="4" w:space="0" w:color="000000"/>
-                                <w:right w:val="none" w:sz="4" w:space="0" w:color="000000"/>
-                              </w:tcBorders>
-                            </w:tcPr>
-                            <w:p/>
-                            <w:p>
-                              <w:pPr>
-                                <w:spacing w:before="20" w:after="40"/>
-                              </w:pPr>
-                            </w:p>
-                          </w:tc>
-                        </w:tr>
-                      </w:tbl>
-                      <w:p/>
-                    </w:tc>
-                    <w:tc>
-                      <w:tcPr>
-                        <w:tcW w:type="dxa" w:w="680"/>
-                        <w:tcBorders>
-                          <w:top w:val="none" w:sz="4" w:space="0" w:color="000000"/>
-                          <w:bottom w:val="none" w:sz="4" w:space="0" w:color="000000"/>
-                          <w:left w:val="none" w:sz="4" w:space="0" w:color="000000"/>
-                          <w:right w:val="none" w:sz="4" w:space="0" w:color="000000"/>
-                        </w:tcBorders>
-                      </w:tcPr>
-                      <w:p/>
-                      <w:p>
-                        <w:pPr>
-                          <w:spacing w:before="40" w:after="0"/>
-                          <w:jc w:val="center"/>
-                        </w:pPr>
-                        <w:r>
-                          <w:rPr>
-                            <w:color w:val="CCCCCC"/>
-                            <w:sz w:val="36"/>
-                          </w:rPr>
-                          <w:t>◯</w:t>
-                        </w:r>
-                      </w:p>
-                    </w:tc>
-                  </w:tr>
-                </w:tbl>
-                <w:p/>
-                <w:p>
-                  <w:pPr>
-                    <w:spacing w:before="0" w:after="20"/>
-                  </w:pPr>
-                </w:p>
-                <w:tbl>
-                  <w:tblPr>
-                    <w:tblW w:type="auto" w:w="0"/>
-                    <w:tblLook w:firstColumn="1" w:firstRow="1" w:lastColumn="0" w:lastRow="0" w:noHBand="0" w:noVBand="1" w:val="04A0"/>
-                  </w:tblPr>
-                  <w:tblGrid>
-                    <w:gridCol w:w="1852"/>
-                    <w:gridCol w:w="1852"/>
-                    <w:gridCol w:w="1852"/>
-                  </w:tblGrid>
-                  <w:tr>
-                    <w:tc>
-                      <w:tcPr>
-                        <w:tcW w:type="dxa" w:w="312"/>
-                        <w:tcBorders>
-                          <w:top w:val="none" w:sz="4" w:space="0" w:color="000000"/>
-                          <w:bottom w:val="none" w:sz="4" w:space="0" w:color="000000"/>
-                          <w:left w:val="none" w:sz="4" w:space="0" w:color="000000"/>
-                          <w:right w:val="none" w:sz="4" w:space="0" w:color="000000"/>
-                        </w:tcBorders>
-                      </w:tcPr>
-                      <w:p/>
-                      <w:p>
-                        <w:pPr>
-                          <w:spacing w:before="60" w:after="0"/>
-                        </w:pPr>
-                        <w:r>
-                          <w:rPr>
-                            <w:b/>
-                            <w:color w:val="0D2D5E"/>
-                            <w:sz w:val="14"/>
-                          </w:rPr>
-                          <w:t>5.</w:t>
-                        </w:r>
-                      </w:p>
-                    </w:tc>
-                    <w:tc>
-                      <w:tcPr>
-                        <w:tcW w:type="dxa" w:w="4535"/>
-                        <w:tcBorders>
-                          <w:top w:val="none" w:sz="4" w:space="0" w:color="000000"/>
-                          <w:bottom w:val="none" w:sz="4" w:space="0" w:color="000000"/>
-                          <w:left w:val="none" w:sz="4" w:space="0" w:color="000000"/>
-                          <w:right w:val="none" w:sz="4" w:space="0" w:color="000000"/>
-                        </w:tcBorders>
-                      </w:tcPr>
-                      <w:p/>
-                      <w:tbl>
-                        <w:tblPr>
-                          <w:tblW w:type="auto" w:w="0"/>
-                          <w:tblLook w:firstColumn="1" w:firstRow="1" w:lastColumn="0" w:lastRow="0" w:noHBand="0" w:noVBand="1" w:val="04A0"/>
-                        </w:tblPr>
-                        <w:tblGrid>
-                          <w:gridCol w:w="4535"/>
-                        </w:tblGrid>
-                        <w:tr>
-                          <w:tc>
-                            <w:tcPr>
-                              <w:tcW w:type="dxa" w:w="4535"/>
-                              <w:tcBorders>
-                                <w:top w:val="none" w:sz="4" w:space="0" w:color="000000"/>
-                                <w:bottom w:val="single" w:sz="2" w:space="0" w:color="BBBBBB"/>
-                                <w:left w:val="none" w:sz="4" w:space="0" w:color="000000"/>
-                                <w:right w:val="none" w:sz="4" w:space="0" w:color="000000"/>
-                              </w:tcBorders>
-                            </w:tcPr>
-                            <w:p/>
-                            <w:p>
-                              <w:pPr>
-                                <w:spacing w:before="20" w:after="40"/>
-                              </w:pPr>
-                            </w:p>
-                          </w:tc>
-                        </w:tr>
-                        <w:tr>
-                          <w:tc>
-                            <w:tcPr>
-                              <w:tcW w:type="dxa" w:w="4535"/>
-                              <w:tcBorders>
-                                <w:top w:val="none" w:sz="4" w:space="0" w:color="000000"/>
-                                <w:bottom w:val="single" w:sz="2" w:space="0" w:color="BBBBBB"/>
-                                <w:left w:val="none" w:sz="4" w:space="0" w:color="000000"/>
-                                <w:right w:val="none" w:sz="4" w:space="0" w:color="000000"/>
-                              </w:tcBorders>
-                            </w:tcPr>
-                            <w:p/>
-                            <w:p>
-                              <w:pPr>
-                                <w:spacing w:before="20" w:after="40"/>
-                              </w:pPr>
-                            </w:p>
-                          </w:tc>
-                        </w:tr>
-                      </w:tbl>
-                      <w:p/>
-                    </w:tc>
-                    <w:tc>
-                      <w:tcPr>
-                        <w:tcW w:type="dxa" w:w="680"/>
-                        <w:tcBorders>
-                          <w:top w:val="none" w:sz="4" w:space="0" w:color="000000"/>
-                          <w:bottom w:val="none" w:sz="4" w:space="0" w:color="000000"/>
-                          <w:left w:val="none" w:sz="4" w:space="0" w:color="000000"/>
-                          <w:right w:val="none" w:sz="4" w:space="0" w:color="000000"/>
-                        </w:tcBorders>
-                      </w:tcPr>
-                      <w:p/>
-                      <w:p>
-                        <w:pPr>
-                          <w:spacing w:before="40" w:after="0"/>
-                          <w:jc w:val="center"/>
-                        </w:pPr>
-                        <w:r>
-                          <w:rPr>
-                            <w:color w:val="CCCCCC"/>
-                            <w:sz w:val="36"/>
-                          </w:rPr>
-                          <w:t>◯</w:t>
-                        </w:r>
-                      </w:p>
-                    </w:tc>
-                  </w:tr>
-                </w:tbl>
-                <w:p/>
-                <w:p>
-                  <w:pPr>
-                    <w:spacing w:before="0" w:after="20"/>
-                  </w:pPr>
-                </w:p>
-                <w:tbl>
-                  <w:tblPr>
-                    <w:tblW w:type="auto" w:w="0"/>
-                    <w:tblLook w:firstColumn="1" w:firstRow="1" w:lastColumn="0" w:lastRow="0" w:noHBand="0" w:noVBand="1" w:val="04A0"/>
-                  </w:tblPr>
-                  <w:tblGrid>
-                    <w:gridCol w:w="1852"/>
-                    <w:gridCol w:w="1852"/>
-                    <w:gridCol w:w="1852"/>
-                  </w:tblGrid>
-                  <w:tr>
-                    <w:tc>
-                      <w:tcPr>
-                        <w:tcW w:type="dxa" w:w="312"/>
-                        <w:tcBorders>
-                          <w:top w:val="none" w:sz="4" w:space="0" w:color="000000"/>
-                          <w:bottom w:val="none" w:sz="4" w:space="0" w:color="000000"/>
-                          <w:left w:val="none" w:sz="4" w:space="0" w:color="000000"/>
-                          <w:right w:val="none" w:sz="4" w:space="0" w:color="000000"/>
-                        </w:tcBorders>
-                      </w:tcPr>
-                      <w:p/>
-                      <w:p>
-                        <w:pPr>
-                          <w:spacing w:before="60" w:after="0"/>
-                        </w:pPr>
-                        <w:r>
-                          <w:rPr>
-                            <w:b/>
-                            <w:color w:val="0D2D5E"/>
-                            <w:sz w:val="14"/>
-                          </w:rPr>
-                          <w:t>6.</w:t>
-                        </w:r>
-                      </w:p>
-                    </w:tc>
-                    <w:tc>
-                      <w:tcPr>
-                        <w:tcW w:type="dxa" w:w="4535"/>
-                        <w:tcBorders>
-                          <w:top w:val="none" w:sz="4" w:space="0" w:color="000000"/>
-                          <w:bottom w:val="none" w:sz="4" w:space="0" w:color="000000"/>
-                          <w:left w:val="none" w:sz="4" w:space="0" w:color="000000"/>
-                          <w:right w:val="none" w:sz="4" w:space="0" w:color="000000"/>
-                        </w:tcBorders>
-                      </w:tcPr>
-                      <w:p/>
-                      <w:tbl>
-                        <w:tblPr>
-                          <w:tblW w:type="auto" w:w="0"/>
-                          <w:tblLook w:firstColumn="1" w:firstRow="1" w:lastColumn="0" w:lastRow="0" w:noHBand="0" w:noVBand="1" w:val="04A0"/>
-                        </w:tblPr>
-                        <w:tblGrid>
-                          <w:gridCol w:w="4535"/>
-                        </w:tblGrid>
-                        <w:tr>
-                          <w:tc>
-                            <w:tcPr>
-                              <w:tcW w:type="dxa" w:w="4535"/>
-                              <w:tcBorders>
-                                <w:top w:val="none" w:sz="4" w:space="0" w:color="000000"/>
-                                <w:bottom w:val="single" w:sz="2" w:space="0" w:color="BBBBBB"/>
-                                <w:left w:val="none" w:sz="4" w:space="0" w:color="000000"/>
-                                <w:right w:val="none" w:sz="4" w:space="0" w:color="000000"/>
-                              </w:tcBorders>
-                            </w:tcPr>
-                            <w:p/>
-                            <w:p>
-                              <w:pPr>
-                                <w:spacing w:before="20" w:after="40"/>
-                              </w:pPr>
-                            </w:p>
-                          </w:tc>
-                        </w:tr>
-                        <w:tr>
-                          <w:tc>
-                            <w:tcPr>
-                              <w:tcW w:type="dxa" w:w="4535"/>
-                              <w:tcBorders>
-                                <w:top w:val="none" w:sz="4" w:space="0" w:color="000000"/>
-                                <w:bottom w:val="single" w:sz="2" w:space="0" w:color="BBBBBB"/>
-                                <w:left w:val="none" w:sz="4" w:space="0" w:color="000000"/>
-                                <w:right w:val="none" w:sz="4" w:space="0" w:color="000000"/>
-                              </w:tcBorders>
-                            </w:tcPr>
-                            <w:p/>
-                            <w:p>
-                              <w:pPr>
-                                <w:spacing w:before="20" w:after="40"/>
-                              </w:pPr>
-                            </w:p>
-                          </w:tc>
-                        </w:tr>
-                      </w:tbl>
-                      <w:p/>
-                    </w:tc>
-                    <w:tc>
-                      <w:tcPr>
-                        <w:tcW w:type="dxa" w:w="680"/>
-                        <w:tcBorders>
-                          <w:top w:val="none" w:sz="4" w:space="0" w:color="000000"/>
-                          <w:bottom w:val="none" w:sz="4" w:space="0" w:color="000000"/>
-                          <w:left w:val="none" w:sz="4" w:space="0" w:color="000000"/>
-                          <w:right w:val="none" w:sz="4" w:space="0" w:color="000000"/>
-                        </w:tcBorders>
-                      </w:tcPr>
-                      <w:p/>
-                      <w:p>
-                        <w:pPr>
-                          <w:spacing w:before="40" w:after="0"/>
-                          <w:jc w:val="center"/>
-                        </w:pPr>
-                        <w:r>
-                          <w:rPr>
-                            <w:color w:val="CCCCCC"/>
-                            <w:sz w:val="36"/>
-                          </w:rPr>
-                          <w:t>◯</w:t>
-                        </w:r>
-                      </w:p>
-                    </w:tc>
-                  </w:tr>
-                </w:tbl>
-                <w:p/>
-                <w:p>
-                  <w:pPr>
-                    <w:spacing w:before="0" w:after="20"/>
-                  </w:pPr>
-                </w:p>
               </w:tc>
             </w:tr>
           </w:tbl>
@@ -1468,7 +741,7 @@
           <w:p/>
           <w:p>
             <w:pPr>
-              <w:spacing w:before="60" w:after="60"/>
+              <w:spacing w:before="80" w:after="80"/>
               <w:jc w:val="center"/>
             </w:pPr>
             <w:r>
@@ -1476,7 +749,7 @@
                 <w:color w:val="666666"/>
                 <w:sz w:val="12"/>
               </w:rPr>
-              <w:t>- - - - - - - - - - - - - - - - - - - - ✂ разрезать ✂ - - - - - - - - - - - - - - - - - - - -</w:t>
+              <w:t>- - - - - - - - - - - - - - - - - - - - - ✂  разрезать  ✂ - - - - - - - - - - - - - - - - - - - -</w:t>
             </w:r>
           </w:p>
         </w:tc>
@@ -1519,7 +792,7 @@
                 <w:p/>
                 <w:p>
                   <w:pPr>
-                    <w:spacing w:before="60" w:after="40"/>
+                    <w:spacing w:before="60" w:after="60"/>
                     <w:jc w:val="center"/>
                     <w:pBdr>
                       <w:bottom w:val="single" w:sz="4" w:space="1" w:color="0D2D5E"/>
@@ -1529,7 +802,7 @@
                     <w:rPr>
                       <w:b/>
                       <w:color w:val="0D2D5E"/>
-                      <w:sz w:val="12"/>
+                      <w:sz w:val="13"/>
                     </w:rPr>
                     <w:t>ЧАЙКАГРАД  ·  ЛИЧНЫЕ СВЕДЕНИЯ</w:t>
                   </w:r>
@@ -1547,13 +820,14 @@
                   <w:tr>
                     <w:tc>
                       <w:tcPr>
-                        <w:tcW w:type="dxa" w:w="1814"/>
+                        <w:tcW w:type="dxa" w:w="2154"/>
                         <w:tcBorders>
                           <w:top w:val="none" w:sz="4" w:space="0" w:color="000000"/>
                           <w:bottom w:val="none" w:sz="4" w:space="0" w:color="000000"/>
                           <w:left w:val="none" w:sz="4" w:space="0" w:color="000000"/>
                           <w:right w:val="none" w:sz="4" w:space="0" w:color="000000"/>
                         </w:tcBorders>
+                        <w:vAlign w:val="top"/>
                       </w:tcPr>
                       <w:p/>
                       <w:tbl>
@@ -1562,32 +836,34 @@
                           <w:tblLook w:firstColumn="1" w:firstRow="1" w:lastColumn="0" w:lastRow="0" w:noHBand="0" w:noVBand="1" w:val="04A0"/>
                         </w:tblPr>
                         <w:tblGrid>
-                          <w:gridCol w:w="1814"/>
+                          <w:gridCol w:w="2154"/>
                         </w:tblGrid>
                         <w:tr>
                           <w:trPr>
-                            <w:trHeight w:val="1417" w:hRule="exact"/>
+                            <w:trHeight w:val="1733" w:hRule="exact"/>
                           </w:trPr>
                           <w:tc>
                             <w:tcPr>
-                              <w:tcW w:type="dxa" w:w="1587"/>
+                              <w:tcW w:type="dxa" w:w="2041"/>
                               <w:tcBorders>
-                                <w:top w:val="single" w:sz="6" w:space="0" w:color="0D2D5E"/>
-                                <w:bottom w:val="single" w:sz="6" w:space="0" w:color="0D2D5E"/>
-                                <w:left w:val="single" w:sz="6" w:space="0" w:color="0D2D5E"/>
-                                <w:right w:val="single" w:sz="6" w:space="0" w:color="0D2D5E"/>
+                                <w:top w:val="single" w:sz="12" w:space="0" w:color="0D2D5E"/>
+                                <w:bottom w:val="single" w:sz="12" w:space="0" w:color="0D2D5E"/>
+                                <w:left w:val="single" w:sz="12" w:space="0" w:color="0D2D5E"/>
+                                <w:right w:val="single" w:sz="12" w:space="0" w:color="0D2D5E"/>
                               </w:tcBorders>
+                              <w:vAlign w:val="center"/>
                             </w:tcPr>
                             <w:p/>
                             <w:p>
                               <w:pPr>
-                                <w:spacing w:before="440" w:after="0"/>
+                                <w:spacing w:before="0" w:after="0"/>
                                 <w:jc w:val="center"/>
                               </w:pPr>
                               <w:r>
                                 <w:rPr>
+                                  <w:b/>
                                   <w:color w:val="CCCCCC"/>
-                                  <w:sz w:val="13"/>
+                                  <w:sz w:val="16"/>
                                 </w:rPr>
                                 <w:t>ФОТО</w:t>
                               </w:r>
@@ -1599,13 +875,14 @@
                     </w:tc>
                     <w:tc>
                       <w:tcPr>
-                        <w:tcW w:type="dxa" w:w="3572"/>
+                        <w:tcW w:type="dxa" w:w="3118"/>
                         <w:tcBorders>
                           <w:top w:val="none" w:sz="4" w:space="0" w:color="000000"/>
                           <w:bottom w:val="none" w:sz="4" w:space="0" w:color="000000"/>
                           <w:left w:val="none" w:sz="4" w:space="0" w:color="000000"/>
                           <w:right w:val="none" w:sz="4" w:space="0" w:color="000000"/>
                         </w:tcBorders>
+                        <w:vAlign w:val="top"/>
                       </w:tcPr>
                       <w:p/>
                       <w:tbl>
@@ -1614,24 +891,25 @@
                           <w:tblLook w:firstColumn="1" w:firstRow="1" w:lastColumn="0" w:lastRow="0" w:noHBand="0" w:noVBand="1" w:val="04A0"/>
                         </w:tblPr>
                         <w:tblGrid>
-                          <w:gridCol w:w="1786"/>
-                          <w:gridCol w:w="1786"/>
+                          <w:gridCol w:w="1559"/>
+                          <w:gridCol w:w="1559"/>
                         </w:tblGrid>
                         <w:tr>
                           <w:tc>
                             <w:tcPr>
-                              <w:tcW w:type="dxa" w:w="1417"/>
+                              <w:tcW w:type="dxa" w:w="1587"/>
                               <w:tcBorders>
                                 <w:top w:val="none" w:sz="4" w:space="0" w:color="000000"/>
                                 <w:bottom w:val="none" w:sz="4" w:space="0" w:color="000000"/>
                                 <w:left w:val="none" w:sz="4" w:space="0" w:color="000000"/>
                                 <w:right w:val="none" w:sz="4" w:space="0" w:color="000000"/>
                               </w:tcBorders>
+                              <w:vAlign w:val="bottom"/>
                             </w:tcPr>
                             <w:p/>
                             <w:p>
                               <w:pPr>
-                                <w:spacing w:before="20" w:after="0"/>
+                                <w:spacing w:before="60" w:after="0"/>
                               </w:pPr>
                               <w:r>
                                 <w:rPr>
@@ -1644,18 +922,19 @@
                           </w:tc>
                           <w:tc>
                             <w:tcPr>
-                              <w:tcW w:type="dxa" w:w="2098"/>
+                              <w:tcW w:type="dxa" w:w="1474"/>
                               <w:tcBorders>
                                 <w:top w:val="none" w:sz="4" w:space="0" w:color="000000"/>
-                                <w:bottom w:val="single" w:sz="4" w:space="0" w:color="555555"/>
+                                <w:bottom w:val="single" w:sz="6" w:space="0" w:color="444444"/>
                                 <w:left w:val="none" w:sz="4" w:space="0" w:color="000000"/>
                                 <w:right w:val="none" w:sz="4" w:space="0" w:color="000000"/>
                               </w:tcBorders>
+                              <w:vAlign w:val="bottom"/>
                             </w:tcPr>
                             <w:p/>
                             <w:p>
                               <w:pPr>
-                                <w:spacing w:before="20" w:after="40"/>
+                                <w:spacing w:before="60" w:after="20"/>
                               </w:pPr>
                             </w:p>
                           </w:tc>
@@ -1668,24 +947,25 @@
                           <w:tblLook w:firstColumn="1" w:firstRow="1" w:lastColumn="0" w:lastRow="0" w:noHBand="0" w:noVBand="1" w:val="04A0"/>
                         </w:tblPr>
                         <w:tblGrid>
-                          <w:gridCol w:w="1786"/>
-                          <w:gridCol w:w="1786"/>
+                          <w:gridCol w:w="1559"/>
+                          <w:gridCol w:w="1559"/>
                         </w:tblGrid>
                         <w:tr>
                           <w:tc>
                             <w:tcPr>
-                              <w:tcW w:type="dxa" w:w="1417"/>
+                              <w:tcW w:type="dxa" w:w="1587"/>
                               <w:tcBorders>
                                 <w:top w:val="none" w:sz="4" w:space="0" w:color="000000"/>
                                 <w:bottom w:val="none" w:sz="4" w:space="0" w:color="000000"/>
                                 <w:left w:val="none" w:sz="4" w:space="0" w:color="000000"/>
                                 <w:right w:val="none" w:sz="4" w:space="0" w:color="000000"/>
                               </w:tcBorders>
+                              <w:vAlign w:val="bottom"/>
                             </w:tcPr>
                             <w:p/>
                             <w:p>
                               <w:pPr>
-                                <w:spacing w:before="20" w:after="0"/>
+                                <w:spacing w:before="60" w:after="0"/>
                               </w:pPr>
                               <w:r>
                                 <w:rPr>
@@ -1698,18 +978,19 @@
                           </w:tc>
                           <w:tc>
                             <w:tcPr>
-                              <w:tcW w:type="dxa" w:w="2098"/>
+                              <w:tcW w:type="dxa" w:w="1474"/>
                               <w:tcBorders>
                                 <w:top w:val="none" w:sz="4" w:space="0" w:color="000000"/>
-                                <w:bottom w:val="single" w:sz="4" w:space="0" w:color="555555"/>
+                                <w:bottom w:val="single" w:sz="6" w:space="0" w:color="444444"/>
                                 <w:left w:val="none" w:sz="4" w:space="0" w:color="000000"/>
                                 <w:right w:val="none" w:sz="4" w:space="0" w:color="000000"/>
                               </w:tcBorders>
+                              <w:vAlign w:val="bottom"/>
                             </w:tcPr>
                             <w:p/>
                             <w:p>
                               <w:pPr>
-                                <w:spacing w:before="20" w:after="40"/>
+                                <w:spacing w:before="60" w:after="20"/>
                               </w:pPr>
                             </w:p>
                           </w:tc>
@@ -1722,24 +1003,25 @@
                           <w:tblLook w:firstColumn="1" w:firstRow="1" w:lastColumn="0" w:lastRow="0" w:noHBand="0" w:noVBand="1" w:val="04A0"/>
                         </w:tblPr>
                         <w:tblGrid>
-                          <w:gridCol w:w="1786"/>
-                          <w:gridCol w:w="1786"/>
+                          <w:gridCol w:w="1559"/>
+                          <w:gridCol w:w="1559"/>
                         </w:tblGrid>
                         <w:tr>
                           <w:tc>
                             <w:tcPr>
-                              <w:tcW w:type="dxa" w:w="1417"/>
+                              <w:tcW w:type="dxa" w:w="1587"/>
                               <w:tcBorders>
                                 <w:top w:val="none" w:sz="4" w:space="0" w:color="000000"/>
                                 <w:bottom w:val="none" w:sz="4" w:space="0" w:color="000000"/>
                                 <w:left w:val="none" w:sz="4" w:space="0" w:color="000000"/>
                                 <w:right w:val="none" w:sz="4" w:space="0" w:color="000000"/>
                               </w:tcBorders>
+                              <w:vAlign w:val="bottom"/>
                             </w:tcPr>
                             <w:p/>
                             <w:p>
                               <w:pPr>
-                                <w:spacing w:before="20" w:after="0"/>
+                                <w:spacing w:before="60" w:after="0"/>
                               </w:pPr>
                               <w:r>
                                 <w:rPr>
@@ -1752,18 +1034,19 @@
                           </w:tc>
                           <w:tc>
                             <w:tcPr>
-                              <w:tcW w:type="dxa" w:w="2098"/>
+                              <w:tcW w:type="dxa" w:w="1474"/>
                               <w:tcBorders>
                                 <w:top w:val="none" w:sz="4" w:space="0" w:color="000000"/>
-                                <w:bottom w:val="single" w:sz="4" w:space="0" w:color="555555"/>
+                                <w:bottom w:val="single" w:sz="6" w:space="0" w:color="444444"/>
                                 <w:left w:val="none" w:sz="4" w:space="0" w:color="000000"/>
                                 <w:right w:val="none" w:sz="4" w:space="0" w:color="000000"/>
                               </w:tcBorders>
+                              <w:vAlign w:val="bottom"/>
                             </w:tcPr>
                             <w:p/>
                             <w:p>
                               <w:pPr>
-                                <w:spacing w:before="20" w:after="40"/>
+                                <w:spacing w:before="60" w:after="20"/>
                               </w:pPr>
                             </w:p>
                           </w:tc>
@@ -1776,24 +1059,25 @@
                           <w:tblLook w:firstColumn="1" w:firstRow="1" w:lastColumn="0" w:lastRow="0" w:noHBand="0" w:noVBand="1" w:val="04A0"/>
                         </w:tblPr>
                         <w:tblGrid>
-                          <w:gridCol w:w="1786"/>
-                          <w:gridCol w:w="1786"/>
+                          <w:gridCol w:w="1559"/>
+                          <w:gridCol w:w="1559"/>
                         </w:tblGrid>
                         <w:tr>
                           <w:tc>
                             <w:tcPr>
-                              <w:tcW w:type="dxa" w:w="1417"/>
+                              <w:tcW w:type="dxa" w:w="1587"/>
                               <w:tcBorders>
                                 <w:top w:val="none" w:sz="4" w:space="0" w:color="000000"/>
                                 <w:bottom w:val="none" w:sz="4" w:space="0" w:color="000000"/>
                                 <w:left w:val="none" w:sz="4" w:space="0" w:color="000000"/>
                                 <w:right w:val="none" w:sz="4" w:space="0" w:color="000000"/>
                               </w:tcBorders>
+                              <w:vAlign w:val="bottom"/>
                             </w:tcPr>
                             <w:p/>
                             <w:p>
                               <w:pPr>
-                                <w:spacing w:before="20" w:after="0"/>
+                                <w:spacing w:before="60" w:after="0"/>
                               </w:pPr>
                               <w:r>
                                 <w:rPr>
@@ -1806,18 +1090,19 @@
                           </w:tc>
                           <w:tc>
                             <w:tcPr>
-                              <w:tcW w:type="dxa" w:w="2098"/>
+                              <w:tcW w:type="dxa" w:w="1474"/>
                               <w:tcBorders>
                                 <w:top w:val="none" w:sz="4" w:space="0" w:color="000000"/>
-                                <w:bottom w:val="single" w:sz="4" w:space="0" w:color="555555"/>
+                                <w:bottom w:val="single" w:sz="6" w:space="0" w:color="444444"/>
                                 <w:left w:val="none" w:sz="4" w:space="0" w:color="000000"/>
                                 <w:right w:val="none" w:sz="4" w:space="0" w:color="000000"/>
                               </w:tcBorders>
+                              <w:vAlign w:val="bottom"/>
                             </w:tcPr>
                             <w:p/>
                             <w:p>
                               <w:pPr>
-                                <w:spacing w:before="20" w:after="40"/>
+                                <w:spacing w:before="60" w:after="20"/>
                               </w:pPr>
                             </w:p>
                           </w:tc>
@@ -1830,7 +1115,7 @@
                 <w:p/>
                 <w:p>
                   <w:pPr>
-                    <w:spacing w:before="80" w:after="20"/>
+                    <w:spacing w:before="100" w:after="20"/>
                     <w:jc w:val="left"/>
                   </w:pPr>
                   <w:r>
@@ -1856,7 +1141,7 @@
                         <w:tcW w:type="dxa" w:w="5443"/>
                         <w:tcBorders>
                           <w:top w:val="none" w:sz="4" w:space="0" w:color="000000"/>
-                          <w:bottom w:val="single" w:sz="4" w:space="0" w:color="555555"/>
+                          <w:bottom w:val="single" w:sz="6" w:space="0" w:color="444444"/>
                           <w:left w:val="none" w:sz="4" w:space="0" w:color="000000"/>
                           <w:right w:val="none" w:sz="4" w:space="0" w:color="000000"/>
                         </w:tcBorders>
@@ -1864,7 +1149,7 @@
                       <w:p/>
                       <w:p>
                         <w:pPr>
-                          <w:spacing w:before="20" w:after="40"/>
+                          <w:spacing w:before="20" w:after="60"/>
                         </w:pPr>
                       </w:p>
                     </w:tc>
@@ -1885,7 +1170,7 @@
                         <w:tcW w:type="dxa" w:w="5443"/>
                         <w:tcBorders>
                           <w:top w:val="none" w:sz="4" w:space="0" w:color="000000"/>
-                          <w:bottom w:val="single" w:sz="4" w:space="0" w:color="555555"/>
+                          <w:bottom w:val="single" w:sz="6" w:space="0" w:color="444444"/>
                           <w:left w:val="none" w:sz="4" w:space="0" w:color="000000"/>
                           <w:right w:val="none" w:sz="4" w:space="0" w:color="000000"/>
                         </w:tcBorders>
@@ -1893,7 +1178,7 @@
                       <w:p/>
                       <w:p>
                         <w:pPr>
-                          <w:spacing w:before="20" w:after="40"/>
+                          <w:spacing w:before="20" w:after="60"/>
                         </w:pPr>
                       </w:p>
                     </w:tc>
@@ -1912,23 +1197,24 @@
                   <w:tr>
                     <w:tc>
                       <w:tcPr>
-                        <w:tcW w:type="dxa" w:w="1020"/>
+                        <w:tcW w:type="dxa" w:w="907"/>
                         <w:tcBorders>
                           <w:top w:val="none" w:sz="4" w:space="0" w:color="000000"/>
                           <w:bottom w:val="none" w:sz="4" w:space="0" w:color="000000"/>
                           <w:left w:val="none" w:sz="4" w:space="0" w:color="000000"/>
                           <w:right w:val="none" w:sz="4" w:space="0" w:color="000000"/>
                         </w:tcBorders>
+                        <w:vAlign w:val="bottom"/>
                       </w:tcPr>
                       <w:p/>
                       <w:p>
                         <w:pPr>
-                          <w:spacing w:before="80" w:after="0"/>
+                          <w:spacing w:before="80" w:after="20"/>
                         </w:pPr>
                         <w:r>
                           <w:rPr>
                             <w:color w:val="0D2D5E"/>
-                            <w:sz w:val="11"/>
+                            <w:sz w:val="12"/>
                           </w:rPr>
                           <w:t>Отряд</w:t>
                         </w:r>
@@ -1936,13 +1222,14 @@
                     </w:tc>
                     <w:tc>
                       <w:tcPr>
-                        <w:tcW w:type="dxa" w:w="4365"/>
+                        <w:tcW w:type="dxa" w:w="4479"/>
                         <w:tcBorders>
                           <w:top w:val="none" w:sz="4" w:space="0" w:color="000000"/>
-                          <w:bottom w:val="single" w:sz="4" w:space="0" w:color="555555"/>
+                          <w:bottom w:val="single" w:sz="6" w:space="0" w:color="444444"/>
                           <w:left w:val="none" w:sz="4" w:space="0" w:color="000000"/>
                           <w:right w:val="none" w:sz="4" w:space="0" w:color="000000"/>
                         </w:tcBorders>
+                        <w:vAlign w:val="bottom"/>
                       </w:tcPr>
                       <w:p/>
                       <w:p>
@@ -1956,9 +1243,9 @@
                 <w:p/>
                 <w:p>
                   <w:pPr>
-                    <w:spacing w:before="120" w:after="20"/>
+                    <w:spacing w:before="140" w:after="20"/>
                     <w:pBdr>
-                      <w:top w:val="single" w:sz="2" w:space="1" w:color="CCCCCC"/>
+                      <w:top w:val="single" w:sz="2" w:space="1" w:color="AAAAAA"/>
                     </w:pBdr>
                   </w:pPr>
                 </w:p>
@@ -2023,14 +1310,14 @@
                   </w:tr>
                   <w:tr>
                     <w:trPr>
-                      <w:trHeight w:val="393" w:hRule="exact"/>
+                      <w:trHeight w:val="433" w:hRule="exact"/>
                     </w:trPr>
                     <w:tc>
                       <w:tcPr>
                         <w:tcW w:type="dxa" w:w="2778"/>
                         <w:tcBorders>
                           <w:top w:val="none" w:sz="4" w:space="0" w:color="000000"/>
-                          <w:bottom w:val="single" w:sz="4" w:space="0" w:color="555555"/>
+                          <w:bottom w:val="single" w:sz="6" w:space="0" w:color="444444"/>
                           <w:left w:val="none" w:sz="4" w:space="0" w:color="000000"/>
                           <w:right w:val="none" w:sz="4" w:space="0" w:color="000000"/>
                         </w:tcBorders>
@@ -2047,7 +1334,7 @@
                         <w:tcW w:type="dxa" w:w="2778"/>
                         <w:tcBorders>
                           <w:top w:val="none" w:sz="4" w:space="0" w:color="000000"/>
-                          <w:bottom w:val="single" w:sz="4" w:space="0" w:color="555555"/>
+                          <w:bottom w:val="single" w:sz="6" w:space="0" w:color="444444"/>
                           <w:left w:val="none" w:sz="4" w:space="0" w:color="000000"/>
                           <w:right w:val="none" w:sz="4" w:space="0" w:color="000000"/>
                         </w:tcBorders>
@@ -2074,7 +1361,7 @@
                       <w:p/>
                       <w:p>
                         <w:pPr>
-                          <w:spacing w:before="0" w:after="0"/>
+                          <w:spacing w:before="0" w:after="40"/>
                           <w:jc w:val="center"/>
                         </w:pPr>
                         <w:r>
@@ -2099,7 +1386,7 @@
                       <w:p/>
                       <w:p>
                         <w:pPr>
-                          <w:spacing w:before="0" w:after="0"/>
+                          <w:spacing w:before="0" w:after="40"/>
                           <w:jc w:val="center"/>
                         </w:pPr>
                         <w:r>
@@ -2129,7 +1416,7 @@
                 <w:p/>
                 <w:p>
                   <w:pPr>
-                    <w:spacing w:before="60" w:after="40"/>
+                    <w:spacing w:before="60" w:after="60"/>
                     <w:jc w:val="center"/>
                     <w:pBdr>
                       <w:bottom w:val="single" w:sz="4" w:space="1" w:color="0D2D5E"/>
@@ -2139,7 +1426,7 @@
                     <w:rPr>
                       <w:b/>
                       <w:color w:val="0D2D5E"/>
-                      <w:sz w:val="12"/>
+                      <w:sz w:val="13"/>
                     </w:rPr>
                     <w:t>ЧАЙКАГРАД  ·  ДОСТИЖЕНИЯ</w:t>
                   </w:r>
@@ -2150,774 +1437,33 @@
                     <w:tblLook w:firstColumn="1" w:firstRow="1" w:lastColumn="0" w:lastRow="0" w:noHBand="0" w:noVBand="1" w:val="04A0"/>
                   </w:tblPr>
                   <w:tblGrid>
-                    <w:gridCol w:w="1852"/>
-                    <w:gridCol w:w="1852"/>
-                    <w:gridCol w:w="1852"/>
+                    <w:gridCol w:w="5556"/>
                   </w:tblGrid>
                   <w:tr>
+                    <w:trPr>
+                      <w:trHeight w:val="4253" w:hRule="atLeast"/>
+                    </w:trPr>
                     <w:tc>
                       <w:tcPr>
-                        <w:tcW w:type="dxa" w:w="312"/>
+                        <w:tcW w:type="dxa" w:w="5329"/>
                         <w:tcBorders>
-                          <w:top w:val="none" w:sz="4" w:space="0" w:color="000000"/>
-                          <w:bottom w:val="none" w:sz="4" w:space="0" w:color="000000"/>
-                          <w:left w:val="none" w:sz="4" w:space="0" w:color="000000"/>
-                          <w:right w:val="none" w:sz="4" w:space="0" w:color="000000"/>
+                          <w:top w:val="single" w:sz="4" w:space="0" w:color="CCCCCC"/>
+                          <w:bottom w:val="single" w:sz="4" w:space="0" w:color="CCCCCC"/>
+                          <w:left w:val="single" w:sz="4" w:space="0" w:color="CCCCCC"/>
+                          <w:right w:val="single" w:sz="4" w:space="0" w:color="CCCCCC"/>
                         </w:tcBorders>
+                        <w:vAlign w:val="top"/>
                       </w:tcPr>
                       <w:p/>
                       <w:p>
                         <w:pPr>
-                          <w:spacing w:before="60" w:after="0"/>
+                          <w:spacing w:before="0" w:after="0"/>
                         </w:pPr>
-                        <w:r>
-                          <w:rPr>
-                            <w:b/>
-                            <w:color w:val="0D2D5E"/>
-                            <w:sz w:val="14"/>
-                          </w:rPr>
-                          <w:t>1.</w:t>
-                        </w:r>
-                      </w:p>
-                    </w:tc>
-                    <w:tc>
-                      <w:tcPr>
-                        <w:tcW w:type="dxa" w:w="4535"/>
-                        <w:tcBorders>
-                          <w:top w:val="none" w:sz="4" w:space="0" w:color="000000"/>
-                          <w:bottom w:val="none" w:sz="4" w:space="0" w:color="000000"/>
-                          <w:left w:val="none" w:sz="4" w:space="0" w:color="000000"/>
-                          <w:right w:val="none" w:sz="4" w:space="0" w:color="000000"/>
-                        </w:tcBorders>
-                      </w:tcPr>
-                      <w:p/>
-                      <w:tbl>
-                        <w:tblPr>
-                          <w:tblW w:type="auto" w:w="0"/>
-                          <w:tblLook w:firstColumn="1" w:firstRow="1" w:lastColumn="0" w:lastRow="0" w:noHBand="0" w:noVBand="1" w:val="04A0"/>
-                        </w:tblPr>
-                        <w:tblGrid>
-                          <w:gridCol w:w="4535"/>
-                        </w:tblGrid>
-                        <w:tr>
-                          <w:tc>
-                            <w:tcPr>
-                              <w:tcW w:type="dxa" w:w="4535"/>
-                              <w:tcBorders>
-                                <w:top w:val="none" w:sz="4" w:space="0" w:color="000000"/>
-                                <w:bottom w:val="single" w:sz="2" w:space="0" w:color="BBBBBB"/>
-                                <w:left w:val="none" w:sz="4" w:space="0" w:color="000000"/>
-                                <w:right w:val="none" w:sz="4" w:space="0" w:color="000000"/>
-                              </w:tcBorders>
-                            </w:tcPr>
-                            <w:p/>
-                            <w:p>
-                              <w:pPr>
-                                <w:spacing w:before="20" w:after="40"/>
-                              </w:pPr>
-                            </w:p>
-                          </w:tc>
-                        </w:tr>
-                        <w:tr>
-                          <w:tc>
-                            <w:tcPr>
-                              <w:tcW w:type="dxa" w:w="4535"/>
-                              <w:tcBorders>
-                                <w:top w:val="none" w:sz="4" w:space="0" w:color="000000"/>
-                                <w:bottom w:val="single" w:sz="2" w:space="0" w:color="BBBBBB"/>
-                                <w:left w:val="none" w:sz="4" w:space="0" w:color="000000"/>
-                                <w:right w:val="none" w:sz="4" w:space="0" w:color="000000"/>
-                              </w:tcBorders>
-                            </w:tcPr>
-                            <w:p/>
-                            <w:p>
-                              <w:pPr>
-                                <w:spacing w:before="20" w:after="40"/>
-                              </w:pPr>
-                            </w:p>
-                          </w:tc>
-                        </w:tr>
-                      </w:tbl>
-                      <w:p/>
-                    </w:tc>
-                    <w:tc>
-                      <w:tcPr>
-                        <w:tcW w:type="dxa" w:w="680"/>
-                        <w:tcBorders>
-                          <w:top w:val="none" w:sz="4" w:space="0" w:color="000000"/>
-                          <w:bottom w:val="none" w:sz="4" w:space="0" w:color="000000"/>
-                          <w:left w:val="none" w:sz="4" w:space="0" w:color="000000"/>
-                          <w:right w:val="none" w:sz="4" w:space="0" w:color="000000"/>
-                        </w:tcBorders>
-                      </w:tcPr>
-                      <w:p/>
-                      <w:p>
-                        <w:pPr>
-                          <w:spacing w:before="40" w:after="0"/>
-                          <w:jc w:val="center"/>
-                        </w:pPr>
-                        <w:r>
-                          <w:rPr>
-                            <w:color w:val="CCCCCC"/>
-                            <w:sz w:val="36"/>
-                          </w:rPr>
-                          <w:t>◯</w:t>
-                        </w:r>
                       </w:p>
                     </w:tc>
                   </w:tr>
                 </w:tbl>
                 <w:p/>
-                <w:p>
-                  <w:pPr>
-                    <w:spacing w:before="0" w:after="20"/>
-                  </w:pPr>
-                </w:p>
-                <w:tbl>
-                  <w:tblPr>
-                    <w:tblW w:type="auto" w:w="0"/>
-                    <w:tblLook w:firstColumn="1" w:firstRow="1" w:lastColumn="0" w:lastRow="0" w:noHBand="0" w:noVBand="1" w:val="04A0"/>
-                  </w:tblPr>
-                  <w:tblGrid>
-                    <w:gridCol w:w="1852"/>
-                    <w:gridCol w:w="1852"/>
-                    <w:gridCol w:w="1852"/>
-                  </w:tblGrid>
-                  <w:tr>
-                    <w:tc>
-                      <w:tcPr>
-                        <w:tcW w:type="dxa" w:w="312"/>
-                        <w:tcBorders>
-                          <w:top w:val="none" w:sz="4" w:space="0" w:color="000000"/>
-                          <w:bottom w:val="none" w:sz="4" w:space="0" w:color="000000"/>
-                          <w:left w:val="none" w:sz="4" w:space="0" w:color="000000"/>
-                          <w:right w:val="none" w:sz="4" w:space="0" w:color="000000"/>
-                        </w:tcBorders>
-                      </w:tcPr>
-                      <w:p/>
-                      <w:p>
-                        <w:pPr>
-                          <w:spacing w:before="60" w:after="0"/>
-                        </w:pPr>
-                        <w:r>
-                          <w:rPr>
-                            <w:b/>
-                            <w:color w:val="0D2D5E"/>
-                            <w:sz w:val="14"/>
-                          </w:rPr>
-                          <w:t>2.</w:t>
-                        </w:r>
-                      </w:p>
-                    </w:tc>
-                    <w:tc>
-                      <w:tcPr>
-                        <w:tcW w:type="dxa" w:w="4535"/>
-                        <w:tcBorders>
-                          <w:top w:val="none" w:sz="4" w:space="0" w:color="000000"/>
-                          <w:bottom w:val="none" w:sz="4" w:space="0" w:color="000000"/>
-                          <w:left w:val="none" w:sz="4" w:space="0" w:color="000000"/>
-                          <w:right w:val="none" w:sz="4" w:space="0" w:color="000000"/>
-                        </w:tcBorders>
-                      </w:tcPr>
-                      <w:p/>
-                      <w:tbl>
-                        <w:tblPr>
-                          <w:tblW w:type="auto" w:w="0"/>
-                          <w:tblLook w:firstColumn="1" w:firstRow="1" w:lastColumn="0" w:lastRow="0" w:noHBand="0" w:noVBand="1" w:val="04A0"/>
-                        </w:tblPr>
-                        <w:tblGrid>
-                          <w:gridCol w:w="4535"/>
-                        </w:tblGrid>
-                        <w:tr>
-                          <w:tc>
-                            <w:tcPr>
-                              <w:tcW w:type="dxa" w:w="4535"/>
-                              <w:tcBorders>
-                                <w:top w:val="none" w:sz="4" w:space="0" w:color="000000"/>
-                                <w:bottom w:val="single" w:sz="2" w:space="0" w:color="BBBBBB"/>
-                                <w:left w:val="none" w:sz="4" w:space="0" w:color="000000"/>
-                                <w:right w:val="none" w:sz="4" w:space="0" w:color="000000"/>
-                              </w:tcBorders>
-                            </w:tcPr>
-                            <w:p/>
-                            <w:p>
-                              <w:pPr>
-                                <w:spacing w:before="20" w:after="40"/>
-                              </w:pPr>
-                            </w:p>
-                          </w:tc>
-                        </w:tr>
-                        <w:tr>
-                          <w:tc>
-                            <w:tcPr>
-                              <w:tcW w:type="dxa" w:w="4535"/>
-                              <w:tcBorders>
-                                <w:top w:val="none" w:sz="4" w:space="0" w:color="000000"/>
-                                <w:bottom w:val="single" w:sz="2" w:space="0" w:color="BBBBBB"/>
-                                <w:left w:val="none" w:sz="4" w:space="0" w:color="000000"/>
-                                <w:right w:val="none" w:sz="4" w:space="0" w:color="000000"/>
-                              </w:tcBorders>
-                            </w:tcPr>
-                            <w:p/>
-                            <w:p>
-                              <w:pPr>
-                                <w:spacing w:before="20" w:after="40"/>
-                              </w:pPr>
-                            </w:p>
-                          </w:tc>
-                        </w:tr>
-                      </w:tbl>
-                      <w:p/>
-                    </w:tc>
-                    <w:tc>
-                      <w:tcPr>
-                        <w:tcW w:type="dxa" w:w="680"/>
-                        <w:tcBorders>
-                          <w:top w:val="none" w:sz="4" w:space="0" w:color="000000"/>
-                          <w:bottom w:val="none" w:sz="4" w:space="0" w:color="000000"/>
-                          <w:left w:val="none" w:sz="4" w:space="0" w:color="000000"/>
-                          <w:right w:val="none" w:sz="4" w:space="0" w:color="000000"/>
-                        </w:tcBorders>
-                      </w:tcPr>
-                      <w:p/>
-                      <w:p>
-                        <w:pPr>
-                          <w:spacing w:before="40" w:after="0"/>
-                          <w:jc w:val="center"/>
-                        </w:pPr>
-                        <w:r>
-                          <w:rPr>
-                            <w:color w:val="CCCCCC"/>
-                            <w:sz w:val="36"/>
-                          </w:rPr>
-                          <w:t>◯</w:t>
-                        </w:r>
-                      </w:p>
-                    </w:tc>
-                  </w:tr>
-                </w:tbl>
-                <w:p/>
-                <w:p>
-                  <w:pPr>
-                    <w:spacing w:before="0" w:after="20"/>
-                  </w:pPr>
-                </w:p>
-                <w:tbl>
-                  <w:tblPr>
-                    <w:tblW w:type="auto" w:w="0"/>
-                    <w:tblLook w:firstColumn="1" w:firstRow="1" w:lastColumn="0" w:lastRow="0" w:noHBand="0" w:noVBand="1" w:val="04A0"/>
-                  </w:tblPr>
-                  <w:tblGrid>
-                    <w:gridCol w:w="1852"/>
-                    <w:gridCol w:w="1852"/>
-                    <w:gridCol w:w="1852"/>
-                  </w:tblGrid>
-                  <w:tr>
-                    <w:tc>
-                      <w:tcPr>
-                        <w:tcW w:type="dxa" w:w="312"/>
-                        <w:tcBorders>
-                          <w:top w:val="none" w:sz="4" w:space="0" w:color="000000"/>
-                          <w:bottom w:val="none" w:sz="4" w:space="0" w:color="000000"/>
-                          <w:left w:val="none" w:sz="4" w:space="0" w:color="000000"/>
-                          <w:right w:val="none" w:sz="4" w:space="0" w:color="000000"/>
-                        </w:tcBorders>
-                      </w:tcPr>
-                      <w:p/>
-                      <w:p>
-                        <w:pPr>
-                          <w:spacing w:before="60" w:after="0"/>
-                        </w:pPr>
-                        <w:r>
-                          <w:rPr>
-                            <w:b/>
-                            <w:color w:val="0D2D5E"/>
-                            <w:sz w:val="14"/>
-                          </w:rPr>
-                          <w:t>3.</w:t>
-                        </w:r>
-                      </w:p>
-                    </w:tc>
-                    <w:tc>
-                      <w:tcPr>
-                        <w:tcW w:type="dxa" w:w="4535"/>
-                        <w:tcBorders>
-                          <w:top w:val="none" w:sz="4" w:space="0" w:color="000000"/>
-                          <w:bottom w:val="none" w:sz="4" w:space="0" w:color="000000"/>
-                          <w:left w:val="none" w:sz="4" w:space="0" w:color="000000"/>
-                          <w:right w:val="none" w:sz="4" w:space="0" w:color="000000"/>
-                        </w:tcBorders>
-                      </w:tcPr>
-                      <w:p/>
-                      <w:tbl>
-                        <w:tblPr>
-                          <w:tblW w:type="auto" w:w="0"/>
-                          <w:tblLook w:firstColumn="1" w:firstRow="1" w:lastColumn="0" w:lastRow="0" w:noHBand="0" w:noVBand="1" w:val="04A0"/>
-                        </w:tblPr>
-                        <w:tblGrid>
-                          <w:gridCol w:w="4535"/>
-                        </w:tblGrid>
-                        <w:tr>
-                          <w:tc>
-                            <w:tcPr>
-                              <w:tcW w:type="dxa" w:w="4535"/>
-                              <w:tcBorders>
-                                <w:top w:val="none" w:sz="4" w:space="0" w:color="000000"/>
-                                <w:bottom w:val="single" w:sz="2" w:space="0" w:color="BBBBBB"/>
-                                <w:left w:val="none" w:sz="4" w:space="0" w:color="000000"/>
-                                <w:right w:val="none" w:sz="4" w:space="0" w:color="000000"/>
-                              </w:tcBorders>
-                            </w:tcPr>
-                            <w:p/>
-                            <w:p>
-                              <w:pPr>
-                                <w:spacing w:before="20" w:after="40"/>
-                              </w:pPr>
-                            </w:p>
-                          </w:tc>
-                        </w:tr>
-                        <w:tr>
-                          <w:tc>
-                            <w:tcPr>
-                              <w:tcW w:type="dxa" w:w="4535"/>
-                              <w:tcBorders>
-                                <w:top w:val="none" w:sz="4" w:space="0" w:color="000000"/>
-                                <w:bottom w:val="single" w:sz="2" w:space="0" w:color="BBBBBB"/>
-                                <w:left w:val="none" w:sz="4" w:space="0" w:color="000000"/>
-                                <w:right w:val="none" w:sz="4" w:space="0" w:color="000000"/>
-                              </w:tcBorders>
-                            </w:tcPr>
-                            <w:p/>
-                            <w:p>
-                              <w:pPr>
-                                <w:spacing w:before="20" w:after="40"/>
-                              </w:pPr>
-                            </w:p>
-                          </w:tc>
-                        </w:tr>
-                      </w:tbl>
-                      <w:p/>
-                    </w:tc>
-                    <w:tc>
-                      <w:tcPr>
-                        <w:tcW w:type="dxa" w:w="680"/>
-                        <w:tcBorders>
-                          <w:top w:val="none" w:sz="4" w:space="0" w:color="000000"/>
-                          <w:bottom w:val="none" w:sz="4" w:space="0" w:color="000000"/>
-                          <w:left w:val="none" w:sz="4" w:space="0" w:color="000000"/>
-                          <w:right w:val="none" w:sz="4" w:space="0" w:color="000000"/>
-                        </w:tcBorders>
-                      </w:tcPr>
-                      <w:p/>
-                      <w:p>
-                        <w:pPr>
-                          <w:spacing w:before="40" w:after="0"/>
-                          <w:jc w:val="center"/>
-                        </w:pPr>
-                        <w:r>
-                          <w:rPr>
-                            <w:color w:val="CCCCCC"/>
-                            <w:sz w:val="36"/>
-                          </w:rPr>
-                          <w:t>◯</w:t>
-                        </w:r>
-                      </w:p>
-                    </w:tc>
-                  </w:tr>
-                </w:tbl>
-                <w:p/>
-                <w:p>
-                  <w:pPr>
-                    <w:spacing w:before="0" w:after="20"/>
-                  </w:pPr>
-                </w:p>
-                <w:tbl>
-                  <w:tblPr>
-                    <w:tblW w:type="auto" w:w="0"/>
-                    <w:tblLook w:firstColumn="1" w:firstRow="1" w:lastColumn="0" w:lastRow="0" w:noHBand="0" w:noVBand="1" w:val="04A0"/>
-                  </w:tblPr>
-                  <w:tblGrid>
-                    <w:gridCol w:w="1852"/>
-                    <w:gridCol w:w="1852"/>
-                    <w:gridCol w:w="1852"/>
-                  </w:tblGrid>
-                  <w:tr>
-                    <w:tc>
-                      <w:tcPr>
-                        <w:tcW w:type="dxa" w:w="312"/>
-                        <w:tcBorders>
-                          <w:top w:val="none" w:sz="4" w:space="0" w:color="000000"/>
-                          <w:bottom w:val="none" w:sz="4" w:space="0" w:color="000000"/>
-                          <w:left w:val="none" w:sz="4" w:space="0" w:color="000000"/>
-                          <w:right w:val="none" w:sz="4" w:space="0" w:color="000000"/>
-                        </w:tcBorders>
-                      </w:tcPr>
-                      <w:p/>
-                      <w:p>
-                        <w:pPr>
-                          <w:spacing w:before="60" w:after="0"/>
-                        </w:pPr>
-                        <w:r>
-                          <w:rPr>
-                            <w:b/>
-                            <w:color w:val="0D2D5E"/>
-                            <w:sz w:val="14"/>
-                          </w:rPr>
-                          <w:t>4.</w:t>
-                        </w:r>
-                      </w:p>
-                    </w:tc>
-                    <w:tc>
-                      <w:tcPr>
-                        <w:tcW w:type="dxa" w:w="4535"/>
-                        <w:tcBorders>
-                          <w:top w:val="none" w:sz="4" w:space="0" w:color="000000"/>
-                          <w:bottom w:val="none" w:sz="4" w:space="0" w:color="000000"/>
-                          <w:left w:val="none" w:sz="4" w:space="0" w:color="000000"/>
-                          <w:right w:val="none" w:sz="4" w:space="0" w:color="000000"/>
-                        </w:tcBorders>
-                      </w:tcPr>
-                      <w:p/>
-                      <w:tbl>
-                        <w:tblPr>
-                          <w:tblW w:type="auto" w:w="0"/>
-                          <w:tblLook w:firstColumn="1" w:firstRow="1" w:lastColumn="0" w:lastRow="0" w:noHBand="0" w:noVBand="1" w:val="04A0"/>
-                        </w:tblPr>
-                        <w:tblGrid>
-                          <w:gridCol w:w="4535"/>
-                        </w:tblGrid>
-                        <w:tr>
-                          <w:tc>
-                            <w:tcPr>
-                              <w:tcW w:type="dxa" w:w="4535"/>
-                              <w:tcBorders>
-                                <w:top w:val="none" w:sz="4" w:space="0" w:color="000000"/>
-                                <w:bottom w:val="single" w:sz="2" w:space="0" w:color="BBBBBB"/>
-                                <w:left w:val="none" w:sz="4" w:space="0" w:color="000000"/>
-                                <w:right w:val="none" w:sz="4" w:space="0" w:color="000000"/>
-                              </w:tcBorders>
-                            </w:tcPr>
-                            <w:p/>
-                            <w:p>
-                              <w:pPr>
-                                <w:spacing w:before="20" w:after="40"/>
-                              </w:pPr>
-                            </w:p>
-                          </w:tc>
-                        </w:tr>
-                        <w:tr>
-                          <w:tc>
-                            <w:tcPr>
-                              <w:tcW w:type="dxa" w:w="4535"/>
-                              <w:tcBorders>
-                                <w:top w:val="none" w:sz="4" w:space="0" w:color="000000"/>
-                                <w:bottom w:val="single" w:sz="2" w:space="0" w:color="BBBBBB"/>
-                                <w:left w:val="none" w:sz="4" w:space="0" w:color="000000"/>
-                                <w:right w:val="none" w:sz="4" w:space="0" w:color="000000"/>
-                              </w:tcBorders>
-                            </w:tcPr>
-                            <w:p/>
-                            <w:p>
-                              <w:pPr>
-                                <w:spacing w:before="20" w:after="40"/>
-                              </w:pPr>
-                            </w:p>
-                          </w:tc>
-                        </w:tr>
-                      </w:tbl>
-                      <w:p/>
-                    </w:tc>
-                    <w:tc>
-                      <w:tcPr>
-                        <w:tcW w:type="dxa" w:w="680"/>
-                        <w:tcBorders>
-                          <w:top w:val="none" w:sz="4" w:space="0" w:color="000000"/>
-                          <w:bottom w:val="none" w:sz="4" w:space="0" w:color="000000"/>
-                          <w:left w:val="none" w:sz="4" w:space="0" w:color="000000"/>
-                          <w:right w:val="none" w:sz="4" w:space="0" w:color="000000"/>
-                        </w:tcBorders>
-                      </w:tcPr>
-                      <w:p/>
-                      <w:p>
-                        <w:pPr>
-                          <w:spacing w:before="40" w:after="0"/>
-                          <w:jc w:val="center"/>
-                        </w:pPr>
-                        <w:r>
-                          <w:rPr>
-                            <w:color w:val="CCCCCC"/>
-                            <w:sz w:val="36"/>
-                          </w:rPr>
-                          <w:t>◯</w:t>
-                        </w:r>
-                      </w:p>
-                    </w:tc>
-                  </w:tr>
-                </w:tbl>
-                <w:p/>
-                <w:p>
-                  <w:pPr>
-                    <w:spacing w:before="0" w:after="20"/>
-                  </w:pPr>
-                </w:p>
-                <w:tbl>
-                  <w:tblPr>
-                    <w:tblW w:type="auto" w:w="0"/>
-                    <w:tblLook w:firstColumn="1" w:firstRow="1" w:lastColumn="0" w:lastRow="0" w:noHBand="0" w:noVBand="1" w:val="04A0"/>
-                  </w:tblPr>
-                  <w:tblGrid>
-                    <w:gridCol w:w="1852"/>
-                    <w:gridCol w:w="1852"/>
-                    <w:gridCol w:w="1852"/>
-                  </w:tblGrid>
-                  <w:tr>
-                    <w:tc>
-                      <w:tcPr>
-                        <w:tcW w:type="dxa" w:w="312"/>
-                        <w:tcBorders>
-                          <w:top w:val="none" w:sz="4" w:space="0" w:color="000000"/>
-                          <w:bottom w:val="none" w:sz="4" w:space="0" w:color="000000"/>
-                          <w:left w:val="none" w:sz="4" w:space="0" w:color="000000"/>
-                          <w:right w:val="none" w:sz="4" w:space="0" w:color="000000"/>
-                        </w:tcBorders>
-                      </w:tcPr>
-                      <w:p/>
-                      <w:p>
-                        <w:pPr>
-                          <w:spacing w:before="60" w:after="0"/>
-                        </w:pPr>
-                        <w:r>
-                          <w:rPr>
-                            <w:b/>
-                            <w:color w:val="0D2D5E"/>
-                            <w:sz w:val="14"/>
-                          </w:rPr>
-                          <w:t>5.</w:t>
-                        </w:r>
-                      </w:p>
-                    </w:tc>
-                    <w:tc>
-                      <w:tcPr>
-                        <w:tcW w:type="dxa" w:w="4535"/>
-                        <w:tcBorders>
-                          <w:top w:val="none" w:sz="4" w:space="0" w:color="000000"/>
-                          <w:bottom w:val="none" w:sz="4" w:space="0" w:color="000000"/>
-                          <w:left w:val="none" w:sz="4" w:space="0" w:color="000000"/>
-                          <w:right w:val="none" w:sz="4" w:space="0" w:color="000000"/>
-                        </w:tcBorders>
-                      </w:tcPr>
-                      <w:p/>
-                      <w:tbl>
-                        <w:tblPr>
-                          <w:tblW w:type="auto" w:w="0"/>
-                          <w:tblLook w:firstColumn="1" w:firstRow="1" w:lastColumn="0" w:lastRow="0" w:noHBand="0" w:noVBand="1" w:val="04A0"/>
-                        </w:tblPr>
-                        <w:tblGrid>
-                          <w:gridCol w:w="4535"/>
-                        </w:tblGrid>
-                        <w:tr>
-                          <w:tc>
-                            <w:tcPr>
-                              <w:tcW w:type="dxa" w:w="4535"/>
-                              <w:tcBorders>
-                                <w:top w:val="none" w:sz="4" w:space="0" w:color="000000"/>
-                                <w:bottom w:val="single" w:sz="2" w:space="0" w:color="BBBBBB"/>
-                                <w:left w:val="none" w:sz="4" w:space="0" w:color="000000"/>
-                                <w:right w:val="none" w:sz="4" w:space="0" w:color="000000"/>
-                              </w:tcBorders>
-                            </w:tcPr>
-                            <w:p/>
-                            <w:p>
-                              <w:pPr>
-                                <w:spacing w:before="20" w:after="40"/>
-                              </w:pPr>
-                            </w:p>
-                          </w:tc>
-                        </w:tr>
-                        <w:tr>
-                          <w:tc>
-                            <w:tcPr>
-                              <w:tcW w:type="dxa" w:w="4535"/>
-                              <w:tcBorders>
-                                <w:top w:val="none" w:sz="4" w:space="0" w:color="000000"/>
-                                <w:bottom w:val="single" w:sz="2" w:space="0" w:color="BBBBBB"/>
-                                <w:left w:val="none" w:sz="4" w:space="0" w:color="000000"/>
-                                <w:right w:val="none" w:sz="4" w:space="0" w:color="000000"/>
-                              </w:tcBorders>
-                            </w:tcPr>
-                            <w:p/>
-                            <w:p>
-                              <w:pPr>
-                                <w:spacing w:before="20" w:after="40"/>
-                              </w:pPr>
-                            </w:p>
-                          </w:tc>
-                        </w:tr>
-                      </w:tbl>
-                      <w:p/>
-                    </w:tc>
-                    <w:tc>
-                      <w:tcPr>
-                        <w:tcW w:type="dxa" w:w="680"/>
-                        <w:tcBorders>
-                          <w:top w:val="none" w:sz="4" w:space="0" w:color="000000"/>
-                          <w:bottom w:val="none" w:sz="4" w:space="0" w:color="000000"/>
-                          <w:left w:val="none" w:sz="4" w:space="0" w:color="000000"/>
-                          <w:right w:val="none" w:sz="4" w:space="0" w:color="000000"/>
-                        </w:tcBorders>
-                      </w:tcPr>
-                      <w:p/>
-                      <w:p>
-                        <w:pPr>
-                          <w:spacing w:before="40" w:after="0"/>
-                          <w:jc w:val="center"/>
-                        </w:pPr>
-                        <w:r>
-                          <w:rPr>
-                            <w:color w:val="CCCCCC"/>
-                            <w:sz w:val="36"/>
-                          </w:rPr>
-                          <w:t>◯</w:t>
-                        </w:r>
-                      </w:p>
-                    </w:tc>
-                  </w:tr>
-                </w:tbl>
-                <w:p/>
-                <w:p>
-                  <w:pPr>
-                    <w:spacing w:before="0" w:after="20"/>
-                  </w:pPr>
-                </w:p>
-                <w:tbl>
-                  <w:tblPr>
-                    <w:tblW w:type="auto" w:w="0"/>
-                    <w:tblLook w:firstColumn="1" w:firstRow="1" w:lastColumn="0" w:lastRow="0" w:noHBand="0" w:noVBand="1" w:val="04A0"/>
-                  </w:tblPr>
-                  <w:tblGrid>
-                    <w:gridCol w:w="1852"/>
-                    <w:gridCol w:w="1852"/>
-                    <w:gridCol w:w="1852"/>
-                  </w:tblGrid>
-                  <w:tr>
-                    <w:tc>
-                      <w:tcPr>
-                        <w:tcW w:type="dxa" w:w="312"/>
-                        <w:tcBorders>
-                          <w:top w:val="none" w:sz="4" w:space="0" w:color="000000"/>
-                          <w:bottom w:val="none" w:sz="4" w:space="0" w:color="000000"/>
-                          <w:left w:val="none" w:sz="4" w:space="0" w:color="000000"/>
-                          <w:right w:val="none" w:sz="4" w:space="0" w:color="000000"/>
-                        </w:tcBorders>
-                      </w:tcPr>
-                      <w:p/>
-                      <w:p>
-                        <w:pPr>
-                          <w:spacing w:before="60" w:after="0"/>
-                        </w:pPr>
-                        <w:r>
-                          <w:rPr>
-                            <w:b/>
-                            <w:color w:val="0D2D5E"/>
-                            <w:sz w:val="14"/>
-                          </w:rPr>
-                          <w:t>6.</w:t>
-                        </w:r>
-                      </w:p>
-                    </w:tc>
-                    <w:tc>
-                      <w:tcPr>
-                        <w:tcW w:type="dxa" w:w="4535"/>
-                        <w:tcBorders>
-                          <w:top w:val="none" w:sz="4" w:space="0" w:color="000000"/>
-                          <w:bottom w:val="none" w:sz="4" w:space="0" w:color="000000"/>
-                          <w:left w:val="none" w:sz="4" w:space="0" w:color="000000"/>
-                          <w:right w:val="none" w:sz="4" w:space="0" w:color="000000"/>
-                        </w:tcBorders>
-                      </w:tcPr>
-                      <w:p/>
-                      <w:tbl>
-                        <w:tblPr>
-                          <w:tblW w:type="auto" w:w="0"/>
-                          <w:tblLook w:firstColumn="1" w:firstRow="1" w:lastColumn="0" w:lastRow="0" w:noHBand="0" w:noVBand="1" w:val="04A0"/>
-                        </w:tblPr>
-                        <w:tblGrid>
-                          <w:gridCol w:w="4535"/>
-                        </w:tblGrid>
-                        <w:tr>
-                          <w:tc>
-                            <w:tcPr>
-                              <w:tcW w:type="dxa" w:w="4535"/>
-                              <w:tcBorders>
-                                <w:top w:val="none" w:sz="4" w:space="0" w:color="000000"/>
-                                <w:bottom w:val="single" w:sz="2" w:space="0" w:color="BBBBBB"/>
-                                <w:left w:val="none" w:sz="4" w:space="0" w:color="000000"/>
-                                <w:right w:val="none" w:sz="4" w:space="0" w:color="000000"/>
-                              </w:tcBorders>
-                            </w:tcPr>
-                            <w:p/>
-                            <w:p>
-                              <w:pPr>
-                                <w:spacing w:before="20" w:after="40"/>
-                              </w:pPr>
-                            </w:p>
-                          </w:tc>
-                        </w:tr>
-                        <w:tr>
-                          <w:tc>
-                            <w:tcPr>
-                              <w:tcW w:type="dxa" w:w="4535"/>
-                              <w:tcBorders>
-                                <w:top w:val="none" w:sz="4" w:space="0" w:color="000000"/>
-                                <w:bottom w:val="single" w:sz="2" w:space="0" w:color="BBBBBB"/>
-                                <w:left w:val="none" w:sz="4" w:space="0" w:color="000000"/>
-                                <w:right w:val="none" w:sz="4" w:space="0" w:color="000000"/>
-                              </w:tcBorders>
-                            </w:tcPr>
-                            <w:p/>
-                            <w:p>
-                              <w:pPr>
-                                <w:spacing w:before="20" w:after="40"/>
-                              </w:pPr>
-                            </w:p>
-                          </w:tc>
-                        </w:tr>
-                      </w:tbl>
-                      <w:p/>
-                    </w:tc>
-                    <w:tc>
-                      <w:tcPr>
-                        <w:tcW w:type="dxa" w:w="680"/>
-                        <w:tcBorders>
-                          <w:top w:val="none" w:sz="4" w:space="0" w:color="000000"/>
-                          <w:bottom w:val="none" w:sz="4" w:space="0" w:color="000000"/>
-                          <w:left w:val="none" w:sz="4" w:space="0" w:color="000000"/>
-                          <w:right w:val="none" w:sz="4" w:space="0" w:color="000000"/>
-                        </w:tcBorders>
-                      </w:tcPr>
-                      <w:p/>
-                      <w:p>
-                        <w:pPr>
-                          <w:spacing w:before="40" w:after="0"/>
-                          <w:jc w:val="center"/>
-                        </w:pPr>
-                        <w:r>
-                          <w:rPr>
-                            <w:color w:val="CCCCCC"/>
-                            <w:sz w:val="36"/>
-                          </w:rPr>
-                          <w:t>◯</w:t>
-                        </w:r>
-                      </w:p>
-                    </w:tc>
-                  </w:tr>
-                </w:tbl>
-                <w:p/>
-                <w:p>
-                  <w:pPr>
-                    <w:spacing w:before="0" w:after="20"/>
-                  </w:pPr>
-                </w:p>
               </w:tc>
             </w:tr>
           </w:tbl>

</xml_diff>